<commit_message>
docs: expand AI use declaration with prompts
</commit_message>
<xml_diff>
--- a/CA1 - Caio Jacob (2023168) - Data Visualisation (AI use).docx
+++ b/CA1 - Caio Jacob (2023168) - Data Visualisation (AI use).docx
@@ -144,18 +144,12 @@
               </wp:anchor>
             </w:drawing>
           </mc:Choice>
-          <mc:Fallback xmlns:wpsCustomData="http://www.wps.cn/officeDocument/2013/wpsCustomData">
+          <mc:Fallback>
             <w:pict>
-              <v:group id="_x0000_s1026" o:spid="_x0000_s1026" o:spt="203" style="position:absolute;left:0pt;margin-left:33.75pt;margin-top:-92.1pt;height:819.15pt;width:18pt;mso-position-horizontal-relative:page;mso-position-vertical-relative:margin;z-index:251659264;mso-width-relative:page;mso-height-relative:page;" coordorigin="5231700,0" coordsize="228600,7560000" o:gfxdata="UEsDBAoAAAAAAIdO4kAAAAAAAAAAAAAAAAAEAAAAZHJzL1BLAwQUAAAACACHTuJAes/VmNsAAAAM&#10;AQAADwAAAGRycy9kb3ducmV2LnhtbE2Py27CMBBF95X6D9ZU6g5sQ0JRGgdVqO0KVSpUQuxMPCQR&#10;8TiKTQJ/X7Nqd/M4unMmX11tywbsfeNIgZwKYEilMw1VCn52H5MlMB80Gd06QgU39LAqHh9ynRk3&#10;0jcO21CxGEI+0wrqELqMc1/WaLWfug4p7k6utzrEtq+46fUYw23LZ0IsuNUNxQu17nBdY3neXqyC&#10;z1GPb3P5PmzOp/XtsEu/9huJSj0/SfEKLOA1/MFw14/qUESno7uQ8axVsHhJI6lgIpfJDNidEPM4&#10;OsYiSRMJvMj5/yeKX1BLAwQUAAAACACHTuJAlKsqBeECAACoCgAADgAAAGRycy9lMm9Eb2MueG1s&#10;7VbbbtswDH0fsH8Q9L76FieO0aQYesOAYgvW7QMUWb4AtqRJSpz+/SjZsdMsw9qu28OwF1ukJIo8&#10;PCJ1frFrarRlSleCL3Bw5mPEOBVZxYsF/vrl5l2CkTaEZ6QWnC3wA9P4Yvn2zXkrUxaKUtQZUwiM&#10;cJ22coFLY2TqeZqWrCH6TEjGYTIXqiEGRFV4mSItWG9qL/T9qdcKlUklKNMatFfdJO4tqqcYFHle&#10;UXYl6KZh3HRWFauJgZB0WUmNl87bPGfUfMpzzQyqFxgiNe4Lh8B4bb/e8pykhSKyrGjvAnmKC0cx&#10;NaTicOhg6ooYgjaq+sFUU1EltMjNGRWN1wXiEIEoAv8Im1slNtLFUqRtIQfQIVFHqL/YLP24XSlU&#10;ZcCEWZjEkzhJAow4aSDz7nh0oAewWlmksOdWyXu5Ur2i6CQb/y5Xjf1DZGjnYH4YYGY7gygowzCZ&#10;+pAAClOBP/GjKJ53iaAlZMvui8MomNk1425aXp/YP4vBFCwET7z96Z51cvBpEP4wfLEfTqJZEh6h&#10;N6ifD94JEE5BeAABSQcEn4DdPJhMfoUd3HE9Ek//HvHuSyKZ47O2JNoTzw/DqQ9RRHvoPsO1Jbyo&#10;GQrGOYef2zcwT6caSPgS2p0KnaRSaXPLRIPsYIEVuOEuNdneadMxbL/EHsrFTVXXoCdpzR8pgIpW&#10;A0Tcu2hHZrfe9VGsRfYA4WtJbyo4645osyIKKg9cvhaq0QLrbxuiGEb1Bw6og79hDOXrUFCHwvpQ&#10;IJyWAoocNQqjTrg0ruh1Xr7fGJFXLiLrV+dM7y6k297yv5D36SQOEn86BaZ29WZM+zj1qllP4Hr6&#10;8eNi8eysa1FXmU28xVKrYn1ZK7Ql0F+u57MgCvtS9GjZf3pAv/5pmztdFiJ4K8TJLALaH9NjnHo+&#10;PZJ5EEPV6/rNqXLadyewPDSUV+RIAP0KekRn/V/myNiEXWFxDxgHaf/Ysi+kQ9mtGh+Yy+9QSwME&#10;CgAAAAAAh07iQAAAAAAAAAAAAAAAAAYAAABfcmVscy9QSwMEFAAAAAgAh07iQIoUZjzRAAAAlAEA&#10;AAsAAABfcmVscy8ucmVsc6WQwWrDMAyG74O9g9F9cZrDGKNOL6PQa+kewNiKYxpbRjLZ+vbzDoNl&#10;9LajfqHvE//+8JkWtSJLpGxg1/WgMDvyMQcD75fj0wsoqTZ7u1BGAzcUOIyPD/szLra2I5ljEdUo&#10;WQzMtZZXrcXNmKx0VDC3zUScbG0jB12su9qAeuj7Z82/GTBumOrkDfDJD6Aut9LMf9gpOiahqXaO&#10;kqZpiu4eVQe2ZY7uyDbhG7lGsxywGvAsGgdqWdd+BH1fv/un3tNHPuO61X6HjOuPV2+6HL8AUEsD&#10;BBQAAAAIAIdO4kB+5uUg9wAAAOEBAAATAAAAW0NvbnRlbnRfVHlwZXNdLnhtbJWRQU7DMBBF90jc&#10;wfIWJU67QAgl6YK0S0CoHGBkTxKLZGx5TGhvj5O2G0SRWNoz/78nu9wcxkFMGNg6quQqL6RA0s5Y&#10;6ir5vt9lD1JwBDIwOMJKHpHlpr69KfdHjyxSmriSfYz+USnWPY7AufNIadK6MEJMx9ApD/oDOlTr&#10;orhX2lFEilmcO2RdNtjC5xDF9pCuTyYBB5bi6bQ4syoJ3g9WQ0ymaiLzg5KdCXlKLjvcW893SUOq&#10;Xwnz5DrgnHtJTxOsQfEKIT7DmDSUCayM+6KAU/53yWw5cuba1mrMm8BNir3hdLG61o5r1zj93/Lt&#10;krp0q+WD6m9QSwECFAAUAAAACACHTuJAfublIPcAAADhAQAAEwAAAAAAAAABACAAAABVBQAAW0Nv&#10;bnRlbnRfVHlwZXNdLnhtbFBLAQIUAAoAAAAAAIdO4kAAAAAAAAAAAAAAAAAGAAAAAAAAAAAAEAAA&#10;ADcEAABfcmVscy9QSwECFAAUAAAACACHTuJAihRmPNEAAACUAQAACwAAAAAAAAABACAAAABbBAAA&#10;X3JlbHMvLnJlbHNQSwECFAAKAAAAAACHTuJAAAAAAAAAAAAAAAAABAAAAAAAAAAAABAAAAAAAAAA&#10;ZHJzL1BLAQIUABQAAAAIAIdO4kB6z9WY2wAAAAwBAAAPAAAAAAAAAAEAIAAAACIAAABkcnMvZG93&#10;bnJldi54bWxQSwECFAAUAAAACACHTuJAlKsqBeECAACoCgAADgAAAAAAAAABACAAAAAqAQAAZHJz&#10;L2Uyb0RvYy54bWxQSwUGAAAAAAYABgBZAQAAfQYAAAAA&#10;">
-                <o:lock v:ext="edit" aspectratio="f"/>
-                <v:group id="_x0000_s1026" o:spid="_x0000_s1026" o:spt="203" style="position:absolute;left:5231700;top:0;height:7560000;width:228600;" coordsize="228600,9144000" o:gfxdata="UEsDBAoAAAAAAIdO4kAAAAAAAAAAAAAAAAAEAAAAZHJzL1BLAwQUAAAACACHTuJAkUBL5cEAAADi&#10;AAAADwAAAGRycy9kb3ducmV2LnhtbEVPXWvCMBR9H+w/hDvY20xa5ybVKEOm+CCCdTB8uzTXttjc&#10;lCZr9d8vwmCPh/M9X15tI3rqfO1YQzJSIIgLZ2ouNXwd1y9TED4gG2wck4YbeVguHh/mmBk38IH6&#10;PJQihrDPUEMVQptJ6YuKLPqRa4kjd3adxRBhV0rT4RDDbSNTpd6kxZpjQ4UtrSoqLvmP1bAZcPgY&#10;J5/97nJe3U7Hyf57l5DWz0+JmoEIdA3/4j/31sT5E5W+jt+nKdwvRQxy8QtQSwMEFAAAAAgAh07i&#10;QDMvBZ47AAAAOQAAABUAAABkcnMvZ3JvdXBzaGFwZXhtbC54bWyzsa/IzVEoSy0qzszPs1Uy1DNQ&#10;UkjNS85PycxLt1UKDXHTtVBSKC5JzEtJzMnPS7VVqkwtVrK34+UCAFBLAwQKAAAAAACHTuJAAAAA&#10;AAAAAAAAAAAABgAAAF9yZWxzL1BLAwQUAAAACACHTuJACS23BNMAAACZAQAACwAAAF9yZWxzLy5y&#10;ZWxzpZBBSwMxEIXvgv8hzN3NtgcRabY3oddawWtIZrPBTSbMxNX+e1NEcKU3D3OYecz3Hm+3/0yz&#10;WpAlUjaw6XpQmB35mIOBl9PT3QMoqTZ7O1NGA2cU2A+3N7sjzra2J5liEdUoWQxMtZZHrcVNmKx0&#10;VDA3ZSROtraVgy7WvdmAetv395p/M2BYMdXBG+CD34I6nUtz/sNO0TEJjbVzlDSNY3TXqDowvZfn&#10;yRZ8TXNjWQ5YDXiWb0kuUgvZtQF9PcPmnxk8feQjLmv3y5Fx+fHVq0KHL1BLAwQUAAAACACHTuJA&#10;VH3oJ/4AAADsAQAAEwAAAFtDb250ZW50X1R5cGVzXS54bWyVkctOwzAQRfdI/IPlLUocWCCEmnRB&#10;gB0gKB8wsieJRWJbHje0f8+4jw2iSF3aM/eeI3ux3EyjmDGS9a6W12UlBTrtjXV9LT9XT8WdFJTA&#10;GRi9w1pukeSyubxYrLYBSXDaUS2HlMK9UqQHnIBKH9DxpPNxgsTH2KsA+gt6VDdVdau0dwldKlLu&#10;kM2ixQ7WYxKPG77em0QcSYqH/WJm1RJCGK2GxKZqduYXpTgQSk7udmiwga5YQ6o/CXlyGnDIvfLT&#10;RGtQvEFMLzCxhjKRlPHfLuJc/l+SLScqfNdZjWUbqeXYO85Hq1PtffTrQAME5P5zGc85/JHDR4za&#10;/VXzA1BLAQIUABQAAAAIAIdO4kBUfegn/gAAAOwBAAATAAAAAAAAAAEAIAAAAJ4CAABbQ29udGVu&#10;dF9UeXBlc10ueG1sUEsBAhQACgAAAAAAh07iQAAAAAAAAAAAAAAAAAYAAAAAAAAAAAAQAAAAfgEA&#10;AF9yZWxzL1BLAQIUABQAAAAIAIdO4kAJLbcE0wAAAJkBAAALAAAAAAAAAAEAIAAAAKIBAABfcmVs&#10;cy8ucmVsc1BLAQIUAAoAAAAAAIdO4kAAAAAAAAAAAAAAAAAEAAAAAAAAAAAAEAAAAAAAAABkcnMv&#10;UEsBAhQAFAAAAAgAh07iQJFAS+XBAAAA4gAAAA8AAAAAAAAAAQAgAAAAIgAAAGRycy9kb3ducmV2&#10;LnhtbFBLAQIUABQAAAAIAIdO4kAzLwWeOwAAADkAAAAVAAAAAAAAAAEAIAAAABABAABkcnMvZ3Jv&#10;dXBzaGFwZXhtbC54bWxQSwUGAAAAAAYABgBgAQAAzQMAAAAA&#10;">
-                  <o:lock v:ext="edit" aspectratio="f"/>
-                  <v:rect id="_x0000_s1026" o:spid="_x0000_s1026" o:spt="1" style="position:absolute;left:0;top:0;height:9144000;width:228600;v-text-anchor:middle;" filled="f" stroked="f" coordsize="21600,21600" o:gfxdata="UEsDBAoAAAAAAIdO4kAAAAAAAAAAAAAAAAAEAAAAZHJzL1BLAwQUAAAACACHTuJAOe/8Ir8AAADj&#10;AAAADwAAAGRycy9kb3ducmV2LnhtbEVPX0/CMBB/J/E7NGfiG7QUnTopJBBN0CcdfoBzPdfF9TrW&#10;CvPbUxMTH+/3/5br0XfiSENsAxuYzxQI4jrYlhsD7/un6R2ImJAtdoHJwA9FWK8uJkssbTjxGx2r&#10;1IgcwrFEAy6lvpQy1o48xlnoiTP3GQaPKZ9DI+2ApxzuO6mVKqTHlnODw562juqv6tsbeL0OpB91&#10;3FSNv3fjx/7l+YCFMVeXc/UAItGY/sV/7p3N85XWhbq9KRbw+1MGQK7OUEsDBBQAAAAIAIdO4kAz&#10;LwWeOwAAADkAAAAQAAAAZHJzL3NoYXBleG1sLnhtbLOxr8jNUShLLSrOzM+zVTLUM1BSSM1Lzk/J&#10;zEu3VQoNcdO1UFIoLknMS0nMyc9LtVWqTC1Wsrfj5QIAUEsDBAoAAAAAAIdO4kAAAAAAAAAAAAAA&#10;AAAGAAAAX3JlbHMvUEsDBBQAAAAIAIdO4kDVXCYozAAAAI8BAAALAAAAX3JlbHMvLnJlbHOlkLFq&#10;AzEMhvdA38Fo7/mSoZQQX7ZC1pBCV2Hr7kzOlrHMNXn7uJRCL2TLoEG/0PcJ7faXMKmZsniOBtZN&#10;C4qiZefjYODz9PH6DkoKRocTRzJwJYF997LaHWnCUpdk9ElUpUQxMJaStlqLHSmgNJwo1knPOWCp&#10;bR50QnvGgfSmbd90/s+AbsFUB2cgH9wG1OmaqvmOHbzNLNyXxnLQ3PfePqJqGTHRV5gqBvNAxYDL&#10;8pvW05paoB+b10+aHX/HI81L8U+Yaf7z6sUbuxtQSwMEFAAAAAgAh07iQFrjEWb3AAAA4gEAABMA&#10;AABbQ29udGVudF9UeXBlc10ueG1slZFNT8QgEIbvJv4HMlfTUj0YY0r3YPWoRtcfMIFpS7YFwmDd&#10;/ffS/bgY18QjzLzP+wTq1XYaxUyRrXcKrssKBDntjXW9go/1U3EHghM6g6N3pGBHDKvm8qJe7wKx&#10;yGnHCoaUwr2UrAeakEsfyOVJ5+OEKR9jLwPqDfYkb6rqVmrvErlUpIUBTd1Sh59jEo/bfH0wiTQy&#10;iIfD4tKlAEMYrcaUTeXszI+W4thQ5uR+hwcb+CprgPy1YZmcLzjmXvLTRGtIvGJMzzhlDWkiS+O/&#10;XKS5/BuyWE5c+K6zmso2cptjbzSfrM7RecBAGf1f/PuSO8Hl/oeab1BLAQIUABQAAAAIAIdO4kBa&#10;4xFm9wAAAOIBAAATAAAAAAAAAAEAIAAAAJACAABbQ29udGVudF9UeXBlc10ueG1sUEsBAhQACgAA&#10;AAAAh07iQAAAAAAAAAAAAAAAAAYAAAAAAAAAAAAQAAAAdwEAAF9yZWxzL1BLAQIUABQAAAAIAIdO&#10;4kDVXCYozAAAAI8BAAALAAAAAAAAAAEAIAAAAJsBAABfcmVscy8ucmVsc1BLAQIUAAoAAAAAAIdO&#10;4kAAAAAAAAAAAAAAAAAEAAAAAAAAAAAAEAAAAAAAAABkcnMvUEsBAhQAFAAAAAgAh07iQDnv/CK/&#10;AAAA4wAAAA8AAAAAAAAAAQAgAAAAIgAAAGRycy9kb3ducmV2LnhtbFBLAQIUABQAAAAIAIdO4kAz&#10;LwWeOwAAADkAAAAQAAAAAAAAAAEAIAAAAA4BAABkcnMvc2hhcGV4bWwueG1sUEsFBgAAAAAGAAYA&#10;WwEAALgDAAAAAA==&#10;">
-                    <v:fill on="f" focussize="0,0"/>
-                    <v:stroke on="f"/>
-                    <v:imagedata o:title=""/>
-                    <o:lock v:ext="edit" aspectratio="f"/>
-                    <v:textbox inset="7.1988188976378pt,7.1988188976378pt,7.1988188976378pt,7.1988188976378pt">
+              <v:group w14:anchorId="3A5C4542" id="Group 1728545881" o:spid="_x0000_s1026" style="position:absolute;margin-left:33.75pt;margin-top:-92.1pt;width:18pt;height:819.15pt;z-index:251656704;mso-position-horizontal-relative:page;mso-position-vertical-relative:margin" coordorigin="52317" coordsize="2286,75600" o:gfxdata="UEsDBBQABgAIAAAAIQC2gziS/gAAAOEBAAATAAAAW0NvbnRlbnRfVHlwZXNdLnhtbJSRQU7DMBBF&#10;90jcwfIWJU67QAgl6YK0S0CoHGBkTxKLZGx5TGhvj5O2G0SRWNoz/78nu9wcxkFMGNg6quQqL6RA&#10;0s5Y6ir5vt9lD1JwBDIwOMJKHpHlpr69KfdHjyxSmriSfYz+USnWPY7AufNIadK6MEJMx9ApD/oD&#10;OlTrorhX2lFEilmcO2RdNtjC5xDF9pCuTyYBB5bi6bQ4syoJ3g9WQ0ymaiLzg5KdCXlKLjvcW893&#10;SUOqXwnz5DrgnHtJTxOsQfEKIT7DmDSUCaxw7Rqn8787ZsmRM9e2VmPeBN4uqYvTtW7jvijg9N/y&#10;JsXecLq0q+WD6m8AAAD//wMAUEsDBBQABgAIAAAAIQA4/SH/1gAAAJQBAAALAAAAX3JlbHMvLnJl&#10;bHOkkMFqwzAMhu+DvYPRfXGawxijTi+j0GvpHsDYimMaW0Yy2fr2M4PBMnrbUb/Q94l/f/hMi1qR&#10;JVI2sOt6UJgd+ZiDgffL8ekFlFSbvV0oo4EbChzGx4f9GRdb25HMsYhqlCwG5lrLq9biZkxWOiqY&#10;22YiTra2kYMu1l1tQD30/bPm3wwYN0x18gb45AdQl1tp5j/sFB2T0FQ7R0nTNEV3j6o9feQzro1i&#10;OWA14Fm+Q8a1a8+Bvu/d/dMb2JY5uiPbhG/ktn4cqGU/er3pcvwCAAD//wMAUEsDBBQABgAIAAAA&#10;IQBhUL29zAIAACAKAAAOAAAAZHJzL2Uyb0RvYy54bWzkVm1v0zAQ/o7Ef7D8neWtabNo6YQ2NiFN&#10;UDH4Aa7jvEiJbWy36f49ZydNulKJvQAS4kvaO9vn57l7fPbF5a5t0JYpXQue4eDMx4hxKvKalxn+&#10;9vXmXYKRNoTnpBGcZfiBaXy5fPvmopMpC0UlmpwpBEG4TjuZ4coYmXqephVriT4TknEYLIRqiQFT&#10;lV6uSAfR28YLfX/udULlUgnKtAbvdT+Ily5+UTBqPheFZgY1GQZsxn2V+67t11tekLRURFY1HWCQ&#10;F6BoSc1h0zHUNTEEbVT9U6i2pkpoUZgzKlpPFEVNmeMAbAL/iM2tEhvpuJRpV8oxTZDaozy9OCz9&#10;tF0pVOdQu0WYxLM4SQKMOGmhVm57dOCHZHWyTGHNrZL3cqUGR9lblv+uUK39BWZo59L8MKaZ7Qyi&#10;4AzDZO5DMSgMBf7Mj6L4vC8EraBadl0cRsHCzplW0+rDifWLGELBREDi7Xf3LMgR02iM4PeEYz+c&#10;RYskPOI7up9P9wTsU6QPQJN05PwEtufBbPYrtnCO9CQV/Tqp3FdEMqdAbcu+z5wfhnMfWET71H2B&#10;g0Z42TAUTGMuf27dqBWdapDNS4RyijpJpdLmlokW2T8ZVgDDHUOyvdOm18R+it2Ui5u6acBP0oY/&#10;coB4rAeks4do/5ndejewWIv8AehrSW9q2OuOaLMiCnoFHJcO+keG9fcNUQyj5iOHrAPeMIaGc2io&#10;Q2N9aBBOKwFtiRqFUW9cGdemepTvN0YUtWNkcfVgBrhQbivtv1D3+SwOEn8+B6X2HWIq+zT0W6ue&#10;wPH048fH+9lV16Kpc1t4m0t3s7CrRqEtgTuBUMq4CYf+8WjmkxXSt08bYqrN/y2UCG7mOFlEcACO&#10;hTINPV8oyXkQQ//r74pTjXW4WSDyeBn8AbUEr1eLE9w/oJbpKnXNxj1DXHKHJ5N95xzabtb0sFv+&#10;AAAA//8DAFBLAwQUAAYACAAAACEADM2rueIAAAAMAQAADwAAAGRycy9kb3ducmV2LnhtbEyPTWvC&#10;QBCG74X+h2UKvelmNbESsxGRticpVAvF25gdk2B2N2TXJP77rqd6m4+Hd57J1qNuWE+dq62RIKYR&#10;MDKFVbUpJfwcPiZLYM6jUdhYQxJu5GCdPz9lmCo7mG/q975kIcS4FCVU3rcp566oSKOb2pZM2J1t&#10;p9GHtiu56nAI4brhsyhacI21CRcqbGlbUXHZX7WEzwGHzVy897vLeXs7HpKv350gKV9fxs0KmKfR&#10;/8Nw1w/qkAenk70a5VgjYfGWBFLCRCzjGbA7Ec3D6BSKOIkF8Dzjj0/kfwAAAP//AwBQSwECLQAU&#10;AAYACAAAACEAtoM4kv4AAADhAQAAEwAAAAAAAAAAAAAAAAAAAAAAW0NvbnRlbnRfVHlwZXNdLnht&#10;bFBLAQItABQABgAIAAAAIQA4/SH/1gAAAJQBAAALAAAAAAAAAAAAAAAAAC8BAABfcmVscy8ucmVs&#10;c1BLAQItABQABgAIAAAAIQBhUL29zAIAACAKAAAOAAAAAAAAAAAAAAAAAC4CAABkcnMvZTJvRG9j&#10;LnhtbFBLAQItABQABgAIAAAAIQAMzau54gAAAAwBAAAPAAAAAAAAAAAAAAAAACYFAABkcnMvZG93&#10;bnJldi54bWxQSwUGAAAAAAQABADzAAAANQYAAAAA&#10;">
+                <v:group id="Group 150243782" o:spid="_x0000_s1027" style="position:absolute;left:52317;width:2286;height:75600" coordsize="2286,91440" o:gfxdata="UEsDBBQABgAIAAAAIQDb4fbL7gAAAIUBAAATAAAAW0NvbnRlbnRfVHlwZXNdLnhtbHyQz07DMAyH&#10;70i8Q+QralM4IITa7kDhCAiNB7ASt43WOlEcyvb2pNu4IODoPz9/n1xv9vOkForiPDdwXVagiI23&#10;jocG3rdPxR0oScgWJ8/UwIEENu3lRb09BBKV0ywNjCmFe63FjDSjlD4Q50nv44wpl3HQAc0OB9I3&#10;VXWrjedEnIq03oC27qjHjympx31un0wiTQLq4bS4shrAECZnMGVTvbD9QSnOhDInjzsyuiBXWQP0&#10;r4R18jfgnHvJr4nOknrFmJ5xzhraRtHWf3Kkpfz/yGo5S+H73hkquyhdjr3R8m2lj09svwAAAP//&#10;AwBQSwMEFAAGAAgAAAAhAFr0LFu/AAAAFQEAAAsAAABfcmVscy8ucmVsc2zPwWrDMAwG4Ptg72B0&#10;X5TuUMaI01uh19I+gLGVxCy2jGSy9e1nemrHjpL4P0nD4SetZiPRyNnCruvBUPYcYp4tXC/Htw8w&#10;Wl0ObuVMFm6kcBhfX4Yzra62kC6xqGlKVgtLreUTUf1CyWnHhXKbTCzJ1VbKjMX5LzcTvvf9HuXR&#10;gPHJNKdgQU5hB+ZyK23zHztFL6w81c5zQp6m6P9TMfB3PtPWFCczVQtB9N4U2rp2HOA44NMz4y8A&#10;AAD//wMAUEsDBBQABgAIAAAAIQD4fOPRxwAAAOIAAAAPAAAAZHJzL2Rvd25yZXYueG1sRE9Na8JA&#10;EL0L/Q/LFHrTTWJtJXUVkSoeRKgWxNuQHZNgdjZkt0n8911B8Ph437NFbyrRUuNKywriUQSCOLO6&#10;5FzB73E9nIJwHlljZZkU3MjBYv4ymGGqbcc/1B58LkIIuxQVFN7XqZQuK8igG9maOHAX2xj0ATa5&#10;1A12IdxUMomiD2mw5NBQYE2rgrLr4c8o2HTYLcfxd7u7Xla383GyP+1iUurttV9+gfDU+6f44d7q&#10;MH8SJe/jz2kC90sBg5z/AwAA//8DAFBLAQItABQABgAIAAAAIQDb4fbL7gAAAIUBAAATAAAAAAAA&#10;AAAAAAAAAAAAAABbQ29udGVudF9UeXBlc10ueG1sUEsBAi0AFAAGAAgAAAAhAFr0LFu/AAAAFQEA&#10;AAsAAAAAAAAAAAAAAAAAHwEAAF9yZWxzLy5yZWxzUEsBAi0AFAAGAAgAAAAhAPh849HHAAAA4gAA&#10;AA8AAAAAAAAAAAAAAAAABwIAAGRycy9kb3ducmV2LnhtbFBLBQYAAAAAAwADALcAAAD7AgAAAAA=&#10;">
+                  <v:rect id="Rectangle 1022607563" o:spid="_x0000_s1028" style="position:absolute;width:2286;height:91440;visibility:visible;mso-wrap-style:square;v-text-anchor:middle" o:gfxdata="UEsDBBQABgAIAAAAIQDb4fbL7gAAAIUBAAATAAAAW0NvbnRlbnRfVHlwZXNdLnhtbHyQz07DMAyH&#10;70i8Q+QralM4IITa7kDhCAiNB7ASt43WOlEcyvb2pNu4IODoPz9/n1xv9vOkForiPDdwXVagiI23&#10;jocG3rdPxR0oScgWJ8/UwIEENu3lRb09BBKV0ywNjCmFe63FjDSjlD4Q50nv44wpl3HQAc0OB9I3&#10;VXWrjedEnIq03oC27qjHjympx31un0wiTQLq4bS4shrAECZnMGVTvbD9QSnOhDInjzsyuiBXWQP0&#10;r4R18jfgnHvJr4nOknrFmJ5xzhraRtHWf3Kkpfz/yGo5S+H73hkquyhdjr3R8m2lj09svwAAAP//&#10;AwBQSwMEFAAGAAgAAAAhAFr0LFu/AAAAFQEAAAsAAABfcmVscy8ucmVsc2zPwWrDMAwG4Ptg72B0&#10;X5TuUMaI01uh19I+gLGVxCy2jGSy9e1nemrHjpL4P0nD4SetZiPRyNnCruvBUPYcYp4tXC/Htw8w&#10;Wl0ObuVMFm6kcBhfX4Yzra62kC6xqGlKVgtLreUTUf1CyWnHhXKbTCzJ1VbKjMX5LzcTvvf9HuXR&#10;gPHJNKdgQU5hB+ZyK23zHztFL6w81c5zQp6m6P9TMfB3PtPWFCczVQtB9N4U2rp2HOA44NMz4y8A&#10;AAD//wMAUEsDBBQABgAIAAAAIQD5nqYWxgAAAOMAAAAPAAAAZHJzL2Rvd25yZXYueG1sRE/NTsMw&#10;DL4j7R0iT+LGkgUoUJZNgECCnUbHA5jGNNUapzRh695+QULi6O/fi9XoO7GnIbaBDcxnCgRxHWzL&#10;jYGP7cvFLYiYkC12gcnAkSKslpOzBZY2HPid9lVqRA7hWKIBl1JfShlrRx7jLPTEmfsKg8eUz6GR&#10;dsBDDved1EoV0mPLucFhT0+O6l314w1srgLpZx0fq8bfufFzu377xsKY8+n4cA8i0Zj+xX/uV5vn&#10;K60LdXNdXMLvTxkAuTwBAAD//wMAUEsBAi0AFAAGAAgAAAAhANvh9svuAAAAhQEAABMAAAAAAAAA&#10;AAAAAAAAAAAAAFtDb250ZW50X1R5cGVzXS54bWxQSwECLQAUAAYACAAAACEAWvQsW78AAAAVAQAA&#10;CwAAAAAAAAAAAAAAAAAfAQAAX3JlbHMvLnJlbHNQSwECLQAUAAYACAAAACEA+Z6mFsYAAADjAAAA&#10;DwAAAAAAAAAAAAAAAAAHAgAAZHJzL2Rvd25yZXYueG1sUEsFBgAAAAADAAMAtwAAAPoCAAAAAA==&#10;" filled="f" stroked="f">
+                    <v:textbox inset="2.53958mm,2.53958mm,2.53958mm,2.53958mm">
                       <w:txbxContent>
                         <w:p>
                           <w:pPr>
@@ -165,12 +159,8 @@
                       </w:txbxContent>
                     </v:textbox>
                   </v:rect>
-                  <v:rect id="_x0000_s1026" o:spid="_x0000_s1026" o:spt="1" style="position:absolute;left:0;top:0;height:8782050;width:228600;v-text-anchor:middle;" fillcolor="#E97132 [3205]" filled="t" stroked="f" coordsize="21600,21600" o:gfxdata="UEsDBAoAAAAAAIdO4kAAAAAAAAAAAAAAAAAEAAAAZHJzL1BLAwQUAAAACACHTuJAb8YwMMQAAADi&#10;AAAADwAAAGRycy9kb3ducmV2LnhtbEWPvW7CMBSF90q8g3WRulTFTgUGpRgG1KowZCBl6XYV3yZp&#10;4+sodgn06esBqePR+dO33l5cJ840hNazgWymQBBX3rZcGzi9vz6uQISIbLHzTAauFGC7mdytMbd+&#10;5COdy1iLNMIhRwNNjH0uZagachhmvidO3qcfHMYkh1raAcc07jr5pJSWDltODw32tGuo+i5/nIFi&#10;VxbXRXj4GH/pC5cv+lC8HXtj7qeZegYR6RL/w7f23hrQ80W2UloniISUcEBu/gBQSwMEFAAAAAgA&#10;h07iQDMvBZ47AAAAOQAAABAAAABkcnMvc2hhcGV4bWwueG1ss7GvyM1RKEstKs7Mz7NVMtQzUFJI&#10;zUvOT8nMS7dVCg1x07VQUiguScxLSczJz0u1VapMLVayt+PlAgBQSwMECgAAAAAAh07iQAAAAAAA&#10;AAAAAAAAAAYAAABfcmVscy9QSwMEFAAAAAgAh07iQNVcJijMAAAAjwEAAAsAAABfcmVscy8ucmVs&#10;c6WQsWoDMQyG90DfwWjv+ZKhlBBftkLWkEJXYevuTM6Wscw1efu4lEIvZMugQb/Q9wnt9pcwqZmy&#10;eI4G1k0LiqJl5+Ng4PP08foOSgpGhxNHMnAlgX33stodacJSl2T0SVSlRDEwlpK2WosdKaA0nCjW&#10;Sc85YKltHnRCe8aB9KZt33T+z4BuwVQHZyAf3AbU6Zqq+Y4dvM0s3JfGctDc994+omoZMdFXmCoG&#10;80DFgMvym9bTmlqgH5vXT5odf8cjzUvxT5hp/vPqxRu7G1BLAwQUAAAACACHTuJAWuMRZvcAAADi&#10;AQAAEwAAAFtDb250ZW50X1R5cGVzXS54bWyVkU1PxCAQhu8m/gcyV9NSPRhjSvdg9ahG1x8wgWlL&#10;tgXCYN3999L9uBjXxCPMvM/7BOrVdhrFTJGtdwquywoEOe2Ndb2Cj/VTcQeCEzqDo3ekYEcMq+by&#10;ol7vArHIaccKhpTCvZSsB5qQSx/I5Unn44QpH2MvA+oN9iRvqupWau8SuVSkhQFN3VKHn2MSj9t8&#10;fTCJNDKIh8Pi0qUAQxitxpRN5ezMj5bi2FDm5H6HBxv4KmuA/LVhmZwvOOZe8tNEa0i8YkzPOGUN&#10;aSJL479cpLn8G7JYTlz4rrOayjZym2NvNJ+sztF5wEAZ/V/8+5I7weX+h5pvUEsBAhQAFAAAAAgA&#10;h07iQFrjEWb3AAAA4gEAABMAAAAAAAAAAQAgAAAAlQIAAFtDb250ZW50X1R5cGVzXS54bWxQSwEC&#10;FAAKAAAAAACHTuJAAAAAAAAAAAAAAAAABgAAAAAAAAAAABAAAAB8AQAAX3JlbHMvUEsBAhQAFAAA&#10;AAgAh07iQNVcJijMAAAAjwEAAAsAAAAAAAAAAQAgAAAAoAEAAF9yZWxzLy5yZWxzUEsBAhQACgAA&#10;AAAAh07iQAAAAAAAAAAAAAAAAAQAAAAAAAAAAAAQAAAAAAAAAGRycy9QSwECFAAUAAAACACHTuJA&#10;b8YwMMQAAADiAAAADwAAAAAAAAABACAAAAAiAAAAZHJzL2Rvd25yZXYueG1sUEsBAhQAFAAAAAgA&#10;h07iQDMvBZ47AAAAOQAAABAAAAAAAAAAAQAgAAAAEwEAAGRycy9zaGFwZXhtbC54bWxQSwUGAAAA&#10;AAYABgBbAQAAvQMAAAAA&#10;">
-                    <v:fill on="t" focussize="0,0"/>
-                    <v:stroke on="f"/>
-                    <v:imagedata o:title=""/>
-                    <o:lock v:ext="edit" aspectratio="f"/>
-                    <v:textbox inset="7.1988188976378pt,7.1988188976378pt,7.1988188976378pt,7.1988188976378pt">
+                  <v:rect id="Rectangle 645180660" o:spid="_x0000_s1029" style="position:absolute;width:2286;height:87820;visibility:visible;mso-wrap-style:square;v-text-anchor:middle" o:gfxdata="UEsDBBQABgAIAAAAIQDb4fbL7gAAAIUBAAATAAAAW0NvbnRlbnRfVHlwZXNdLnhtbHyQz07DMAyH&#10;70i8Q+QralM4IITa7kDhCAiNB7ASt43WOlEcyvb2pNu4IODoPz9/n1xv9vOkForiPDdwXVagiI23&#10;jocG3rdPxR0oScgWJ8/UwIEENu3lRb09BBKV0ywNjCmFe63FjDSjlD4Q50nv44wpl3HQAc0OB9I3&#10;VXWrjedEnIq03oC27qjHjympx31un0wiTQLq4bS4shrAECZnMGVTvbD9QSnOhDInjzsyuiBXWQP0&#10;r4R18jfgnHvJr4nOknrFmJ5xzhraRtHWf3Kkpfz/yGo5S+H73hkquyhdjr3R8m2lj09svwAAAP//&#10;AwBQSwMEFAAGAAgAAAAhAFr0LFu/AAAAFQEAAAsAAABfcmVscy8ucmVsc2zPwWrDMAwG4Ptg72B0&#10;X5TuUMaI01uh19I+gLGVxCy2jGSy9e1nemrHjpL4P0nD4SetZiPRyNnCruvBUPYcYp4tXC/Htw8w&#10;Wl0ObuVMFm6kcBhfX4Yzra62kC6xqGlKVgtLreUTUf1CyWnHhXKbTCzJ1VbKjMX5LzcTvvf9HuXR&#10;gPHJNKdgQU5hB+ZyK23zHztFL6w81c5zQp6m6P9TMfB3PtPWFCczVQtB9N4U2rp2HOA44NMz4y8A&#10;AAD//wMAUEsDBBQABgAIAAAAIQA8kkIcyAAAAOIAAAAPAAAAZHJzL2Rvd25yZXYueG1sRI9Pa8Iw&#10;GMbvg32H8A52m2llBumMMqZjCrvo9NDbS/PaFJs3pYlav705CDs+PP/4zRaDa8WF+tB41pCPMhDE&#10;lTcN1xr2f99vUxAhIhtsPZOGGwVYzJ+fZlgYf+UtXXaxFmmEQ4EabIxdIWWoLDkMI98RJ+/oe4cx&#10;yb6WpsdrGnetHGeZkg4bTg8WO/qyVJ12Z6dhheWAuRxv1GFrf/a4Kg/L31Lr15fh8wNEpCH+hx/t&#10;tdGg3if5NFMqQSSkhANyfgcAAP//AwBQSwECLQAUAAYACAAAACEA2+H2y+4AAACFAQAAEwAAAAAA&#10;AAAAAAAAAAAAAAAAW0NvbnRlbnRfVHlwZXNdLnhtbFBLAQItABQABgAIAAAAIQBa9CxbvwAAABUB&#10;AAALAAAAAAAAAAAAAAAAAB8BAABfcmVscy8ucmVsc1BLAQItABQABgAIAAAAIQA8kkIcyAAAAOIA&#10;AAAPAAAAAAAAAAAAAAAAAAcCAABkcnMvZG93bnJldi54bWxQSwUGAAAAAAMAAwC3AAAA/AIAAAAA&#10;" fillcolor="#e97132 [3205]" stroked="f">
+                    <v:textbox inset="2.53958mm,2.53958mm,2.53958mm,2.53958mm">
                       <w:txbxContent>
                         <w:p>
                           <w:pPr>
@@ -180,12 +170,8 @@
                       </w:txbxContent>
                     </v:textbox>
                   </v:rect>
-                  <v:rect id="_x0000_s1026" o:spid="_x0000_s1026" o:spt="1" style="position:absolute;left:0;top:8915400;height:228600;width:228600;v-text-anchor:middle;" fillcolor="#156082 [3204]" filled="t" stroked="f" coordsize="21600,21600" o:gfxdata="UEsDBAoAAAAAAIdO4kAAAAAAAAAAAAAAAAAEAAAAZHJzL1BLAwQUAAAACACHTuJA/IfROcIAAADi&#10;AAAADwAAAGRycy9kb3ducmV2LnhtbEWPX2vCQBDE3wt+h2OFvtWLin+InoJCSl9aMBZ9XXNrEszt&#10;hdw22m/fKxT6OMzMb5j19uEa1VMXas8GxqMEFHHhbc2lgc9j9rIEFQTZYuOZDHxTgO1m8LTG1Po7&#10;H6jPpVQRwiFFA5VIm2odioochpFviaN39Z1DibIrte3wHuGu0ZMkmWuHNceFClvaV1Tc8i9nYKeP&#10;5496f8nf+0wW8z47CR5ejXkejpMVKKGH/If/2m/WwDQSZ8vFdAa/l+Id0JsfUEsDBBQAAAAIAIdO&#10;4kAzLwWeOwAAADkAAAAQAAAAZHJzL3NoYXBleG1sLnhtbLOxr8jNUShLLSrOzM+zVTLUM1BSSM1L&#10;zk/JzEu3VQoNcdO1UFIoLknMS0nMyc9LtVWqTC1Wsrfj5QIAUEsDBAoAAAAAAIdO4kAAAAAAAAAA&#10;AAAAAAAGAAAAX3JlbHMvUEsDBBQAAAAIAIdO4kDVXCYozAAAAI8BAAALAAAAX3JlbHMvLnJlbHOl&#10;kLFqAzEMhvdA38Fo7/mSoZQQX7ZC1pBCV2Hr7kzOlrHMNXn7uJRCL2TLoEG/0PcJ7faXMKmZsniO&#10;BtZNC4qiZefjYODz9PH6DkoKRocTRzJwJYF997LaHWnCUpdk9ElUpUQxMJaStlqLHSmgNJwo1knP&#10;OWCpbR50QnvGgfSmbd90/s+AbsFUB2cgH9wG1OmaqvmOHbzNLNyXxnLQ3PfePqJqGTHRV5gqBvNA&#10;xYDL8pvW05paoB+b10+aHX/HI81L8U+Yaf7z6sUbuxtQSwMEFAAAAAgAh07iQFrjEWb3AAAA4gEA&#10;ABMAAABbQ29udGVudF9UeXBlc10ueG1slZFNT8QgEIbvJv4HMlfTUj0YY0r3YPWoRtcfMIFpS7YF&#10;wmDd/ffS/bgY18QjzLzP+wTq1XYaxUyRrXcKrssKBDntjXW9go/1U3EHghM6g6N3pGBHDKvm8qJe&#10;7wKxyGnHCoaUwr2UrAeakEsfyOVJ5+OEKR9jLwPqDfYkb6rqVmrvErlUpIUBTd1Sh59jEo/bfH0w&#10;iTQyiIfD4tKlAEMYrcaUTeXszI+W4thQ5uR+hwcb+CprgPy1YZmcLzjmXvLTRGtIvGJMzzhlDWki&#10;S+O/XKS5/BuyWE5c+K6zmso2cptjbzSfrM7RecBAGf1f/PuSO8Hl/oeab1BLAQIUABQAAAAIAIdO&#10;4kBa4xFm9wAAAOIBAAATAAAAAAAAAAEAIAAAAJMCAABbQ29udGVudF9UeXBlc10ueG1sUEsBAhQA&#10;CgAAAAAAh07iQAAAAAAAAAAAAAAAAAYAAAAAAAAAAAAQAAAAegEAAF9yZWxzL1BLAQIUABQAAAAI&#10;AIdO4kDVXCYozAAAAI8BAAALAAAAAAAAAAEAIAAAAJ4BAABfcmVscy8ucmVsc1BLAQIUAAoAAAAA&#10;AIdO4kAAAAAAAAAAAAAAAAAEAAAAAAAAAAAAEAAAAAAAAABkcnMvUEsBAhQAFAAAAAgAh07iQPyH&#10;0TnCAAAA4gAAAA8AAAAAAAAAAQAgAAAAIgAAAGRycy9kb3ducmV2LnhtbFBLAQIUABQAAAAIAIdO&#10;4kAzLwWeOwAAADkAAAAQAAAAAAAAAAEAIAAAABEBAABkcnMvc2hhcGV4bWwueG1sUEsFBgAAAAAG&#10;AAYAWwEAALsDAAAAAA==&#10;">
-                    <v:fill on="t" focussize="0,0"/>
-                    <v:stroke on="f"/>
-                    <v:imagedata o:title=""/>
-                    <o:lock v:ext="edit" aspectratio="f"/>
-                    <v:textbox inset="7.1988188976378pt,7.1988188976378pt,7.1988188976378pt,7.1988188976378pt">
+                  <v:rect id="Rectangle 300658735" o:spid="_x0000_s1030" style="position:absolute;top:89154;width:2286;height:2286;visibility:visible;mso-wrap-style:square;v-text-anchor:middle" o:gfxdata="UEsDBBQABgAIAAAAIQDb4fbL7gAAAIUBAAATAAAAW0NvbnRlbnRfVHlwZXNdLnhtbHyQz07DMAyH&#10;70i8Q+QralM4IITa7kDhCAiNB7ASt43WOlEcyvb2pNu4IODoPz9/n1xv9vOkForiPDdwXVagiI23&#10;jocG3rdPxR0oScgWJ8/UwIEENu3lRb09BBKV0ywNjCmFe63FjDSjlD4Q50nv44wpl3HQAc0OB9I3&#10;VXWrjedEnIq03oC27qjHjympx31un0wiTQLq4bS4shrAECZnMGVTvbD9QSnOhDInjzsyuiBXWQP0&#10;r4R18jfgnHvJr4nOknrFmJ5xzhraRtHWf3Kkpfz/yGo5S+H73hkquyhdjr3R8m2lj09svwAAAP//&#10;AwBQSwMEFAAGAAgAAAAhAFr0LFu/AAAAFQEAAAsAAABfcmVscy8ucmVsc2zPwWrDMAwG4Ptg72B0&#10;X5TuUMaI01uh19I+gLGVxCy2jGSy9e1nemrHjpL4P0nD4SetZiPRyNnCruvBUPYcYp4tXC/Htw8w&#10;Wl0ObuVMFm6kcBhfX4Yzra62kC6xqGlKVgtLreUTUf1CyWnHhXKbTCzJ1VbKjMX5LzcTvvf9HuXR&#10;gPHJNKdgQU5hB+ZyK23zHztFL6w81c5zQp6m6P9TMfB3PtPWFCczVQtB9N4U2rp2HOA44NMz4y8A&#10;AAD//wMAUEsDBBQABgAIAAAAIQCXJYG6xwAAAOIAAAAPAAAAZHJzL2Rvd25yZXYueG1sRI/RasJA&#10;FETfC/7DcgXf6kYlVaOriCL4IqWxH3DJXrPB7N2YXWP6912h0MdhZs4w621va9FR6yvHCibjBARx&#10;4XTFpYLvy/F9AcIHZI21Y1LwQx62m8HbGjPtnvxFXR5KESHsM1RgQmgyKX1hyKIfu4Y4elfXWgxR&#10;tqXULT4j3NZymiQf0mLFccFgQ3tDxS1/WAXpMvWHrv+s0ZjL4b6f707nvFRqNOx3KxCB+vAf/muf&#10;tIJZJKaL+SyF16V4B+TmFwAA//8DAFBLAQItABQABgAIAAAAIQDb4fbL7gAAAIUBAAATAAAAAAAA&#10;AAAAAAAAAAAAAABbQ29udGVudF9UeXBlc10ueG1sUEsBAi0AFAAGAAgAAAAhAFr0LFu/AAAAFQEA&#10;AAsAAAAAAAAAAAAAAAAAHwEAAF9yZWxzLy5yZWxzUEsBAi0AFAAGAAgAAAAhAJclgbrHAAAA4gAA&#10;AA8AAAAAAAAAAAAAAAAABwIAAGRycy9kb3ducmV2LnhtbFBLBQYAAAAAAwADALcAAAD7AgAAAAA=&#10;" fillcolor="#156082 [3204]" stroked="f">
+                    <v:textbox inset="2.53958mm,2.53958mm,2.53958mm,2.53958mm">
                       <w:txbxContent>
                         <w:p>
                           <w:pPr>
@@ -196,6 +182,7 @@
                     </v:textbox>
                   </v:rect>
                 </v:group>
+                <w10:wrap anchorx="page" anchory="margin"/>
               </v:group>
             </w:pict>
           </mc:Fallback>
@@ -227,7 +214,7 @@
                     <pic:cNvPicPr preferRelativeResize="0"/>
                   </pic:nvPicPr>
                   <pic:blipFill>
-                    <a:blip r:embed="rId12"/>
+                    <a:blip r:embed="rId13"/>
                     <a:srcRect/>
                     <a:stretch>
                       <a:fillRect/>
@@ -585,23 +572,13 @@
                 <w:szCs w:val="32"/>
               </w:rPr>
             </w:pPr>
-            <w:proofErr w:type="spellStart"/>
             <w:r>
               <w:rPr>
                 <w:color w:val="000000"/>
                 <w:sz w:val="32"/>
                 <w:szCs w:val="32"/>
               </w:rPr>
-              <w:t>Taufique</w:t>
-            </w:r>
-            <w:proofErr w:type="spellEnd"/>
-            <w:r>
-              <w:rPr>
-                <w:color w:val="000000"/>
-                <w:sz w:val="32"/>
-                <w:szCs w:val="32"/>
-              </w:rPr>
-              <w:t xml:space="preserve"> Ahmed</w:t>
+              <w:t>Taufique Ahmed</w:t>
             </w:r>
           </w:p>
         </w:tc>
@@ -856,14 +833,7 @@
                                 <w:color w:val="000000"/>
                                 <w:sz w:val="28"/>
                               </w:rPr>
-                              <w:t xml:space="preserve">I </w:t>
-                            </w:r>
-                            <w:r>
-                              <w:rPr>
-                                <w:color w:val="000000"/>
-                                <w:sz w:val="28"/>
-                              </w:rPr>
-                              <w:t>declare it to be my own work and that all material from third parties has been appropriately referenced.</w:t>
+                              <w:t>I declare it to be my own work and that all material from third parties has been appropriately referenced.</w:t>
                             </w:r>
                           </w:p>
                           <w:p>
@@ -875,14 +845,7 @@
                                 <w:color w:val="000000"/>
                                 <w:sz w:val="28"/>
                               </w:rPr>
-                              <w:t xml:space="preserve"> I further confirm that this work has not previously been submitted for assessment by myself or someone else in CCT College Dublin or any other higher </w:t>
-                            </w:r>
-                            <w:r>
-                              <w:rPr>
-                                <w:color w:val="000000"/>
-                                <w:sz w:val="28"/>
-                              </w:rPr>
-                              <w:t>education institution.</w:t>
+                              <w:t xml:space="preserve"> I further confirm that this work has not previously been submitted for assessment by myself or someone else in CCT College Dublin or any other higher education institution.</w:t>
                             </w:r>
                           </w:p>
                         </w:txbxContent>
@@ -896,14 +859,11 @@
               </wp:anchor>
             </w:drawing>
           </mc:Choice>
-          <mc:Fallback xmlns:wpsCustomData="http://www.wps.cn/officeDocument/2013/wpsCustomData">
+          <mc:Fallback>
             <w:pict>
-              <v:rect id="_x0000_s1026" o:spid="_x0000_s1026" o:spt="1" style="position:absolute;left:0pt;margin-left:-3.1pt;margin-top:1.75pt;height:226.5pt;width:456.75pt;mso-position-horizontal-relative:margin;z-index:251660288;mso-width-relative:page;mso-height-relative:page;" fillcolor="#FFFFFF [3201]" filled="t" stroked="t" coordsize="21600,21600" o:gfxdata="UEsDBAoAAAAAAIdO4kAAAAAAAAAAAAAAAAAEAAAAZHJzL1BLAwQUAAAACACHTuJAUdWiFNgAAAAI&#10;AQAADwAAAGRycy9kb3ducmV2LnhtbE2PzU7DMBCE70i8g7VI3Fq7DQkQsqkQqAd+eiDlAZxkiSPi&#10;dRQ7/Xl7zAmOoxnNfFNsTnYQB5p87xhhtVQgiBvX9twhfO63izsQPmhu9eCYEM7kYVNeXhQ6b92R&#10;P+hQhU7EEva5RjAhjLmUvjFktV+6kTh6X26yOkQ5dbKd9DGW20Gulcqk1T3HBaNHejLUfFezRdju&#10;H19ldZ7f53r3/PZSJ8EYs0O8vlqpBxCBTuEvDL/4ER3KyFS7mVsvBoRFto5JhCQFEe17dZuAqBFu&#10;0iwFWRby/4HyB1BLAwQUAAAACACHTuJAaHHqSEQCAAC6BAAADgAAAGRycy9lMm9Eb2MueG1srVTb&#10;bhMxEH1H4h8sv9PdRN0mRE0q1BCEVEFF4QMmXm/Wkm/Yzu3vOfaGNi1I9IE8bMY74zNnzszs9c3B&#10;aLaTISpn53x0UXMmrXCtsps5//F99W7KWUxkW9LOyjk/yshvFm/fXO/9TI5d73QrAwOIjbO9n/M+&#10;JT+rqih6aSheOC8tnJ0LhhKOYVO1gfZAN7oa1/VVtXeh9cEJGSPeLgcnPyGG1wC6rlNCLp3YGmnT&#10;gBqkpoSSYq985IvCtuukSF+7LsrE9Jyj0lSeSAJ7nZ/V4ppmm0C+V+JEgV5D4UVNhpRF0keoJSVi&#10;26D+gDJKBBddly6EM9VQSFEEVYzqF9o89ORlqQVSR/8oevx/sOLL7j4w1WISJuNpc9lMp2POLBl0&#10;/hvUI7vRkp35INjexxnuPfj7cDpFmLn6QxdM/kdd7FBEPj6KLA+JCbxspnU9GTecCfjG08lV05Q2&#10;VE/XfYjpk3SGZWPOA3gUcWl3FxNSIvR3SM4WnVbtSmldDmGzvtWB7QgdX5VfbjKuPAvTlu1z+maS&#10;mRDmuMP8wDQeWkS7KQmfXYnnyKPmqoZSf0HOzJYU+4FBQRimLLitbXGBZr2k9qNtWTp6yGyxZjyz&#10;iYYzLbGUMEpcIqX/HYfStEWFuS1DI7KVDusDQLK5du0RTY5erBTI3VFM9xQw5iOkxegj4c8tBZDQ&#10;ny1m6/3oMvcnlcNlM6mxLOHcsz73kBW9w0ZBvMG8TWW/cqHWfdgm16nStCcqJ7IY6dKY0/rlnTk/&#10;l6inT87iF1BLAwQKAAAAAACHTuJAAAAAAAAAAAAAAAAABgAAAF9yZWxzL1BLAwQUAAAACACHTuJA&#10;ihRmPNEAAACUAQAACwAAAF9yZWxzLy5yZWxzpZDBasMwDIbvg72D0X1xmsMYo04vo9Br6R7A2Ipj&#10;GltGMtn69vMOg2X0tqN+oe8T//7wmRa1IkukbGDX9aAwO/IxBwPvl+PTCyipNnu7UEYDNxQ4jI8P&#10;+zMutrYjmWMR1ShZDMy1lletxc2YrHRUMLfNRJxsbSMHXay72oB66Ptnzb8ZMG6Y6uQN8MkPoC63&#10;0sx/2Ck6JqGpdo6SpmmK7h5VB7Zlju7INuEbuUazHLAa8CwaB2pZ134EfV+/+6fe00c+47rVfoeM&#10;649Xb7ocvwBQSwMEFAAAAAgAh07iQH7m5SD3AAAA4QEAABMAAABbQ29udGVudF9UeXBlc10ueG1s&#10;lZFBTsMwEEX3SNzB8hYlTrtACCXpgrRLQKgcYGRPEotkbHlMaG+Pk7YbRJFY2jP/vye73BzGQUwY&#10;2Dqq5CovpEDSzljqKvm+32UPUnAEMjA4wkoekeWmvr0p90ePLFKauJJ9jP5RKdY9jsC580hp0row&#10;QkzH0CkP+gM6VOuiuFfaUUSKWZw7ZF022MLnEMX2kK5PJgEHluLptDizKgneD1ZDTKZqIvODkp0J&#10;eUouO9xbz3dJQ6pfCfPkOuCce0lPE6xB8QohPsOYNJQJrIz7ooBT/nfJbDly5trWasybwE2KveF0&#10;sbrWjmvXOP3f8u2SunSr5YPqb1BLAQIUABQAAAAIAIdO4kB+5uUg9wAAAOEBAAATAAAAAAAAAAEA&#10;IAAAALUEAABbQ29udGVudF9UeXBlc10ueG1sUEsBAhQACgAAAAAAh07iQAAAAAAAAAAAAAAAAAYA&#10;AAAAAAAAAAAQAAAAlwMAAF9yZWxzL1BLAQIUABQAAAAIAIdO4kCKFGY80QAAAJQBAAALAAAAAAAA&#10;AAEAIAAAALsDAABfcmVscy8ucmVsc1BLAQIUAAoAAAAAAIdO4kAAAAAAAAAAAAAAAAAEAAAAAAAA&#10;AAAAEAAAAAAAAABkcnMvUEsBAhQAFAAAAAgAh07iQFHVohTYAAAACAEAAA8AAAAAAAAAAQAgAAAA&#10;IgAAAGRycy9kb3ducmV2LnhtbFBLAQIUABQAAAAIAIdO4kBocepIRAIAALoEAAAOAAAAAAAAAAEA&#10;IAAAACcBAABkcnMvZTJvRG9jLnhtbFBLBQYAAAAABgAGAFkBAADdBQAAAAA=&#10;">
-                <v:fill on="t" focussize="0,0"/>
-                <v:stroke weight="2.25pt" color="#156082 [3204]" joinstyle="round" startarrowwidth="narrow" startarrowlength="short" endarrowwidth="narrow" endarrowlength="short"/>
-                <v:imagedata o:title=""/>
-                <o:lock v:ext="edit" aspectratio="f"/>
-                <v:textbox inset="7.1988188976378pt,3.59842519685039pt,7.1988188976378pt,3.59842519685039pt">
+              <v:rect w14:anchorId="16378E96" id="Rectangle 1728545882" o:spid="_x0000_s1031" style="position:absolute;margin-left:-3.1pt;margin-top:1.75pt;width:456.75pt;height:226.5pt;z-index:251658752;visibility:visible;mso-wrap-style:square;mso-wrap-distance-left:9pt;mso-wrap-distance-top:0;mso-wrap-distance-right:9pt;mso-wrap-distance-bottom:0;mso-position-horizontal:absolute;mso-position-horizontal-relative:margin;mso-position-vertical:absolute;mso-position-vertical-relative:text;v-text-anchor:top" o:gfxdata="UEsDBBQABgAIAAAAIQC2gziS/gAAAOEBAAATAAAAW0NvbnRlbnRfVHlwZXNdLnhtbJSRQU7DMBBF&#10;90jcwfIWJU67QAgl6YK0S0CoHGBkTxKLZGx5TGhvj5O2G0SRWNoz/78nu9wcxkFMGNg6quQqL6RA&#10;0s5Y6ir5vt9lD1JwBDIwOMJKHpHlpr69KfdHjyxSmriSfYz+USnWPY7AufNIadK6MEJMx9ApD/oD&#10;OlTrorhX2lFEilmcO2RdNtjC5xDF9pCuTyYBB5bi6bQ4syoJ3g9WQ0ymaiLzg5KdCXlKLjvcW893&#10;SUOqXwnz5DrgnHtJTxOsQfEKIT7DmDSUCaxw7Rqn8787ZsmRM9e2VmPeBN4uqYvTtW7jvijg9N/y&#10;JsXecLq0q+WD6m8AAAD//wMAUEsDBBQABgAIAAAAIQA4/SH/1gAAAJQBAAALAAAAX3JlbHMvLnJl&#10;bHOkkMFqwzAMhu+DvYPRfXGawxijTi+j0GvpHsDYimMaW0Yy2fr2M4PBMnrbUb/Q94l/f/hMi1qR&#10;JVI2sOt6UJgd+ZiDgffL8ekFlFSbvV0oo4EbChzGx4f9GRdb25HMsYhqlCwG5lrLq9biZkxWOiqY&#10;22YiTra2kYMu1l1tQD30/bPm3wwYN0x18gb45AdQl1tp5j/sFB2T0FQ7R0nTNEV3j6o9feQzro1i&#10;OWA14Fm+Q8a1a8+Bvu/d/dMb2JY5uiPbhG/ktn4cqGU/er3pcvwCAAD//wMAUEsDBBQABgAIAAAA&#10;IQAFpbiWMgIAAHUEAAAOAAAAZHJzL2Uyb0RvYy54bWysVG2P0zAM/o7Ef4jynbUr661U607oxhDS&#10;iZs4+AFemq6R8kaSrd2/x8nGtgMkJMSX1I4d+7Efu4v7UUly4M4Loxs6neSUcM1MK/Suod++rt9U&#10;lPgAugVpNG/okXt6v3z9ajHYmhemN7LljmAQ7evBNrQPwdZZ5lnPFfiJsVyjsTNOQUDV7bLWwYDR&#10;lcyKPL/LBuNa6wzj3uPt6mSkyxS/6zgLT13neSCyoYgtpNOlcxvPbLmAeufA9oKdYcA/oFAgNCa9&#10;hFpBALJ34rdQSjBnvOnChBmVma4TjKcasJpp/ks1zz1YnmrB5nh7aZP/f2HZ58PGEdEid/OiKmdl&#10;VRWUaFDI1RfsHuid5OTGhg0brK/x3bPduLPmUYzVj51T8Yt1kTE1+XhpMh8DYXhZVnk+L0pKGNqK&#10;an5XlomG7PrcOh8+cqNIFBrqEEdqLhwefcCU6PrTJWbzRop2LaRMSpwc/iAdOQByLsM0cowvXnhJ&#10;TYaYvZxHIICD10kIKCqLrfB6l/K9eJJG8hoYGOP6z8EjthX4/oQgBTnNmTN73SIaqHsO7QfdknC0&#10;2GiNq0EjIK8okRwXCYXkF0DIv/thdVJjkZGYExVRCuN2TMy+jbHizda0R2TbW7YWiPERfNiAw3mf&#10;YnbcAcz7fQ8OschPGofs3XQWiQpJmZXzHDfI3Vq2txbQrDe4WtjGk/gQ0qLFerV5vw+mE4m9K5Qz&#10;ZpztRNF5D+Py3OrJ6/q3WP4AAAD//wMAUEsDBBQABgAIAAAAIQC/zHkg3wAAAAgBAAAPAAAAZHJz&#10;L2Rvd25yZXYueG1sTI8xT8MwFIR3JP6D9ZDYWoeWpJDmpaqQMiAmUoZ2c+PXJBA/h9hNw7/HTGU8&#10;3enuu2wzmU6MNLjWMsLDPAJBXFndco3wsStmTyCcV6xVZ5kQfsjBJr+9yVSq7YXfaSx9LUIJu1Qh&#10;NN73qZSuasgoN7c9cfBOdjDKBznUUg/qEspNJxdRlEijWg4LjerppaHqqzwbhIjftsV3+7naj6/7&#10;4qAKszuUBvH+btquQXia/DUMf/gBHfLAdLRn1k50CLNkEZIIyxhEsJ+j1RLEEeExTmKQeSb/H8h/&#10;AQAA//8DAFBLAQItABQABgAIAAAAIQC2gziS/gAAAOEBAAATAAAAAAAAAAAAAAAAAAAAAABbQ29u&#10;dGVudF9UeXBlc10ueG1sUEsBAi0AFAAGAAgAAAAhADj9If/WAAAAlAEAAAsAAAAAAAAAAAAAAAAA&#10;LwEAAF9yZWxzLy5yZWxzUEsBAi0AFAAGAAgAAAAhAAWluJYyAgAAdQQAAA4AAAAAAAAAAAAAAAAA&#10;LgIAAGRycy9lMm9Eb2MueG1sUEsBAi0AFAAGAAgAAAAhAL/MeSDfAAAACAEAAA8AAAAAAAAAAAAA&#10;AAAAjAQAAGRycy9kb3ducmV2LnhtbFBLBQYAAAAABAAEAPMAAACYBQAAAAA=&#10;" fillcolor="white [3201]" strokecolor="#156082 [3204]" strokeweight="2.25pt">
+                <v:stroke startarrowwidth="narrow" startarrowlength="short" endarrowwidth="narrow" endarrowlength="short" joinstyle="round"/>
+                <v:textbox inset="2.53958mm,1.2694mm,2.53958mm,1.2694mm">
                   <w:txbxContent>
                     <w:p>
                       <w:pPr>
@@ -956,6 +916,7 @@
                     </w:p>
                   </w:txbxContent>
                 </v:textbox>
+                <w10:wrap anchorx="margin"/>
               </v:rect>
             </w:pict>
           </mc:Fallback>
@@ -970,7 +931,7 @@
     <w:p>
       <w:pPr>
         <w:sectPr>
-          <w:footerReference w:type="default" r:id="rId13"/>
+          <w:footerReference w:type="default" r:id="rId14"/>
           <w:pgSz w:w="11906" w:h="16838"/>
           <w:pgMar w:top="1440" w:right="1440" w:bottom="1440" w:left="1440" w:header="708" w:footer="708" w:gutter="0"/>
           <w:cols w:space="720"/>
@@ -1046,13 +1007,415 @@
       </w:r>
     </w:p>
     <w:p>
-      <w:pPr>
-        <w:pStyle w:val="NormalWeb"/>
-        <w:rPr>
-          <w:rFonts w:ascii="Calibri" w:hAnsi="Calibri" w:cs="Calibri"/>
-        </w:rPr>
-      </w:pPr>
-    </w:p>
+      <w:r>
+        <w:rPr>
+          <w:rFonts w:eastAsiaTheme="majorEastAsia"/>
+          <w:color w:val="3A3A3A" w:themeColor="background2" w:themeShade="40"/>
+          <w:spacing w:val="-10"/>
+          <w:kern w:val="28"/>
+          <w:sz w:val="28"/>
+          <w:szCs w:val="28"/>
+        </w:rPr>
+        <w:t>AI Prompts and Relevant Outputs – Selected Examples</w:t>
+      </w:r>
+    </w:p>
+    <w:p>
+      <w:pPr>
+        <w:pStyle w:val="ListParagraph"/>
+        <w:numPr>
+          <w:ilvl w:val="0"/>
+          <w:numId w:val="1"/>
+        </w:numPr>
+        <w:rPr>
+          <w:b/>
+          <w:bCs/>
+        </w:rPr>
+      </w:pPr>
+      <w:r>
+        <w:rPr>
+          <w:b/>
+          <w:bCs/>
+        </w:rPr>
+        <w:t>Prompt</w:t>
+      </w:r>
+      <w:r>
+        <w:rPr>
+          <w:b/>
+          <w:bCs/>
+        </w:rPr>
+        <w:t>:</w:t>
+      </w:r>
+      <w:r>
+        <w:rPr>
+          <w:b/>
+          <w:bCs/>
+        </w:rPr>
+        <w:t xml:space="preserve"> Data exploration</w:t>
+      </w:r>
+    </w:p>
+    <w:p>
+      <w:r>
+        <w:t>“Find the AI-related occupations in the May 2023 employment dataset and help me identify suitable occupations to analyse.”</w:t>
+      </w:r>
+    </w:p>
+    <w:p>
+      <w:pPr>
+        <w:rPr>
+          <w:b/>
+          <w:bCs/>
+        </w:rPr>
+      </w:pPr>
+      <w:r>
+        <w:rPr>
+          <w:b/>
+          <w:bCs/>
+        </w:rPr>
+        <w:t>Relevant AI output:</w:t>
+      </w:r>
+    </w:p>
+    <w:p>
+      <w:r>
+        <w:t>The analysis identified Data Scientists, Software Developers, and Computer and Information Research Scientists as suitable occupations for comparison. The dataset did not contain an occupation explicitly named “Artificial Intelligence”, so Computer and Information Research Scientists was treated as an AI-related research occupation for the analysis.</w:t>
+      </w:r>
+    </w:p>
+    <w:p>
+      <w:pPr>
+        <w:rPr>
+          <w:b/>
+          <w:bCs/>
+        </w:rPr>
+      </w:pPr>
+      <w:r>
+        <w:rPr>
+          <w:b/>
+          <w:bCs/>
+        </w:rPr>
+        <w:t>How it was verified:</w:t>
+      </w:r>
+    </w:p>
+    <w:p>
+      <w:r>
+        <w:t>The occupation names were checked directly against the dataset using Pandas.</w:t>
+      </w:r>
+    </w:p>
+    <w:p>
+      <w:pPr>
+        <w:pStyle w:val="ListParagraph"/>
+        <w:numPr>
+          <w:ilvl w:val="0"/>
+          <w:numId w:val="1"/>
+        </w:numPr>
+        <w:rPr>
+          <w:b/>
+          <w:bCs/>
+        </w:rPr>
+      </w:pPr>
+      <w:r>
+        <w:rPr>
+          <w:b/>
+          <w:bCs/>
+        </w:rPr>
+        <w:t>Prompt</w:t>
+      </w:r>
+      <w:r>
+        <w:rPr>
+          <w:b/>
+          <w:bCs/>
+        </w:rPr>
+        <w:t>:</w:t>
+      </w:r>
+      <w:r>
+        <w:rPr>
+          <w:b/>
+          <w:bCs/>
+        </w:rPr>
+        <w:t xml:space="preserve"> Employment comparison</w:t>
+      </w:r>
+    </w:p>
+    <w:p>
+      <w:r>
+        <w:t>“Help me create a visualisation comparing the total employment of the three selected technology roles.”</w:t>
+      </w:r>
+    </w:p>
+    <w:p>
+      <w:pPr>
+        <w:rPr>
+          <w:b/>
+          <w:bCs/>
+        </w:rPr>
+      </w:pPr>
+      <w:r>
+        <w:rPr>
+          <w:b/>
+          <w:bCs/>
+        </w:rPr>
+        <w:t>Relevant AI output:</w:t>
+      </w:r>
+    </w:p>
+    <w:p>
+      <w:r>
+        <w:t>A bar chart was recommended as an appropriate visualisation for comparing total employment across discrete occupation categories.</w:t>
+      </w:r>
+    </w:p>
+    <w:p>
+      <w:pPr>
+        <w:rPr>
+          <w:b/>
+          <w:bCs/>
+        </w:rPr>
+      </w:pPr>
+      <w:r>
+        <w:rPr>
+          <w:b/>
+          <w:bCs/>
+        </w:rPr>
+        <w:t>How it was verified:</w:t>
+      </w:r>
+    </w:p>
+    <w:p>
+      <w:r>
+        <w:t>The chart was implemented in the notebook and the employment values were checked against the dataset.</w:t>
+      </w:r>
+    </w:p>
+    <w:p>
+      <w:pPr>
+        <w:pStyle w:val="ListParagraph"/>
+        <w:numPr>
+          <w:ilvl w:val="0"/>
+          <w:numId w:val="1"/>
+        </w:numPr>
+        <w:rPr>
+          <w:b/>
+          <w:bCs/>
+        </w:rPr>
+      </w:pPr>
+      <w:r>
+        <w:rPr>
+          <w:b/>
+          <w:bCs/>
+        </w:rPr>
+        <w:t>Prompt</w:t>
+      </w:r>
+      <w:r>
+        <w:rPr>
+          <w:b/>
+          <w:bCs/>
+        </w:rPr>
+        <w:t>:</w:t>
+      </w:r>
+      <w:r>
+        <w:rPr>
+          <w:b/>
+          <w:bCs/>
+        </w:rPr>
+        <w:t xml:space="preserve"> Visualisation choice</w:t>
+      </w:r>
+    </w:p>
+    <w:p>
+      <w:r>
+        <w:t>“Explain why a bar chart is suitable for comparing employment across these three occupations and what can be learned from the visualisation.”</w:t>
+      </w:r>
+    </w:p>
+    <w:p>
+      <w:pPr>
+        <w:rPr>
+          <w:b/>
+          <w:bCs/>
+        </w:rPr>
+      </w:pPr>
+      <w:r>
+        <w:rPr>
+          <w:b/>
+          <w:bCs/>
+        </w:rPr>
+        <w:t>Relevant AI output:</w:t>
+      </w:r>
+    </w:p>
+    <w:p>
+      <w:r>
+        <w:t>The response explained that a bar chart is suitable for comparing discrete categories using a quantitative measure such as total employment.</w:t>
+      </w:r>
+    </w:p>
+    <w:p>
+      <w:pPr>
+        <w:rPr>
+          <w:b/>
+          <w:bCs/>
+        </w:rPr>
+      </w:pPr>
+      <w:r>
+        <w:rPr>
+          <w:b/>
+          <w:bCs/>
+        </w:rPr>
+        <w:lastRenderedPageBreak/>
+        <w:t>How it was verified:</w:t>
+      </w:r>
+    </w:p>
+    <w:p>
+      <w:r>
+        <w:t>The explanation was reviewed and incorporated into the Markdown section accompanying the visualisation.</w:t>
+      </w:r>
+    </w:p>
+    <w:p>
+      <w:pPr>
+        <w:pStyle w:val="ListParagraph"/>
+        <w:numPr>
+          <w:ilvl w:val="0"/>
+          <w:numId w:val="1"/>
+        </w:numPr>
+        <w:rPr>
+          <w:b/>
+          <w:bCs/>
+        </w:rPr>
+      </w:pPr>
+      <w:r>
+        <w:rPr>
+          <w:b/>
+          <w:bCs/>
+        </w:rPr>
+        <w:t>Prompt</w:t>
+      </w:r>
+      <w:r>
+        <w:rPr>
+          <w:b/>
+          <w:bCs/>
+        </w:rPr>
+        <w:t>:</w:t>
+      </w:r>
+      <w:r>
+        <w:rPr>
+          <w:b/>
+          <w:bCs/>
+        </w:rPr>
+        <w:t xml:space="preserve"> Troubleshooting the employment trend</w:t>
+      </w:r>
+    </w:p>
+    <w:p>
+      <w:r>
+        <w:t>“Why are the employment trend lines not displaying correctly when comparing the 2022 and 2023 datasets?”</w:t>
+      </w:r>
+    </w:p>
+    <w:p>
+      <w:pPr>
+        <w:rPr>
+          <w:b/>
+          <w:bCs/>
+        </w:rPr>
+      </w:pPr>
+      <w:r>
+        <w:rPr>
+          <w:b/>
+          <w:bCs/>
+        </w:rPr>
+        <w:t>Relevant AI output:</w:t>
+      </w:r>
+    </w:p>
+    <w:p>
+      <w:r>
+        <w:t>The issue was investigated by checking how the year information was assigned to the datasets. The 2022 data required a YEAR value before being combined with the 2023 data.</w:t>
+      </w:r>
+    </w:p>
+    <w:p>
+      <w:pPr>
+        <w:rPr>
+          <w:b/>
+          <w:bCs/>
+        </w:rPr>
+      </w:pPr>
+      <w:r>
+        <w:rPr>
+          <w:b/>
+          <w:bCs/>
+        </w:rPr>
+        <w:t>How it was verified:</w:t>
+      </w:r>
+    </w:p>
+    <w:p>
+      <w:r>
+        <w:t>The YEAR column was corrected for the 2022 dataset and the notebook was executed again to verify the result.</w:t>
+      </w:r>
+    </w:p>
+    <w:p>
+      <w:pPr>
+        <w:pStyle w:val="ListParagraph"/>
+        <w:numPr>
+          <w:ilvl w:val="0"/>
+          <w:numId w:val="1"/>
+        </w:numPr>
+        <w:rPr>
+          <w:b/>
+          <w:bCs/>
+        </w:rPr>
+      </w:pPr>
+      <w:r>
+        <w:rPr>
+          <w:b/>
+          <w:bCs/>
+        </w:rPr>
+        <w:t>Prompt</w:t>
+      </w:r>
+      <w:r>
+        <w:rPr>
+          <w:b/>
+          <w:bCs/>
+        </w:rPr>
+        <w:t>:</w:t>
+      </w:r>
+      <w:r>
+        <w:rPr>
+          <w:b/>
+          <w:bCs/>
+        </w:rPr>
+        <w:t xml:space="preserve"> Visualisation and wage analysis</w:t>
+      </w:r>
+    </w:p>
+    <w:p>
+      <w:r>
+        <w:t>“Help me understand what can be learned from comparing employment levels and mean annual wages for Software Developers, Data Scientists, and Computer and Information Research Scientists.”</w:t>
+      </w:r>
+    </w:p>
+    <w:p>
+      <w:pPr>
+        <w:rPr>
+          <w:b/>
+          <w:bCs/>
+        </w:rPr>
+      </w:pPr>
+      <w:r>
+        <w:rPr>
+          <w:b/>
+          <w:bCs/>
+        </w:rPr>
+        <w:t>Relevant AI output:</w:t>
+      </w:r>
+    </w:p>
+    <w:p>
+      <w:r>
+        <w:t>The analysis highlighted that Software Developers had the highest employment level, while Computer and Information Research Scientists had the highest mean annual wage among the three selected occupations.</w:t>
+      </w:r>
+    </w:p>
+    <w:p>
+      <w:pPr>
+        <w:rPr>
+          <w:b/>
+          <w:bCs/>
+        </w:rPr>
+      </w:pPr>
+      <w:r>
+        <w:rPr>
+          <w:b/>
+          <w:bCs/>
+        </w:rPr>
+        <w:t>How it was verified:</w:t>
+      </w:r>
+    </w:p>
+    <w:p>
+      <w:r>
+        <w:t>The values were checked against the employment dataset and the scatter plot was generated in the notebook.</w:t>
+      </w:r>
+    </w:p>
+    <w:p/>
     <w:p>
       <w:pPr>
         <w:pStyle w:val="Heading3"/>
@@ -1064,360 +1427,9 @@
         <w:rPr>
           <w:rFonts w:cs="Calibri"/>
         </w:rPr>
-        <w:t>AI Use Summary</w:t>
-      </w:r>
-    </w:p>
-    <w:p/>
-    <w:tbl>
-      <w:tblPr>
-        <w:tblStyle w:val="TableGrid"/>
-        <w:tblW w:w="0" w:type="auto"/>
-        <w:jc w:val="center"/>
-        <w:tblLayout w:type="fixed"/>
-        <w:tblLook w:val="04A0" w:firstRow="1" w:lastRow="0" w:firstColumn="1" w:lastColumn="0" w:noHBand="0" w:noVBand="1"/>
-      </w:tblPr>
-      <w:tblGrid>
-        <w:gridCol w:w="1413"/>
-        <w:gridCol w:w="3402"/>
-        <w:gridCol w:w="4201"/>
-      </w:tblGrid>
-      <w:tr>
-        <w:trPr>
-          <w:jc w:val="center"/>
-        </w:trPr>
-        <w:tc>
-          <w:tcPr>
-            <w:tcW w:w="1413" w:type="dxa"/>
-            <w:vAlign w:val="center"/>
-          </w:tcPr>
-          <w:p>
-            <w:r>
-              <w:rPr>
-                <w:rFonts w:eastAsia="Times New Roman"/>
-                <w:b/>
-                <w:bCs/>
-                <w:sz w:val="24"/>
-                <w:szCs w:val="24"/>
-              </w:rPr>
-              <w:t>AI Tool</w:t>
-            </w:r>
-          </w:p>
-        </w:tc>
-        <w:tc>
-          <w:tcPr>
-            <w:tcW w:w="3402" w:type="dxa"/>
-            <w:vAlign w:val="center"/>
-          </w:tcPr>
-          <w:p>
-            <w:r>
-              <w:rPr>
-                <w:rFonts w:eastAsia="Times New Roman"/>
-                <w:b/>
-                <w:bCs/>
-                <w:sz w:val="24"/>
-                <w:szCs w:val="24"/>
-              </w:rPr>
-              <w:t>Purpose of Use</w:t>
-            </w:r>
-          </w:p>
-        </w:tc>
-        <w:tc>
-          <w:tcPr>
-            <w:tcW w:w="4201" w:type="dxa"/>
-            <w:vAlign w:val="center"/>
-          </w:tcPr>
-          <w:p>
-            <w:r>
-              <w:rPr>
-                <w:rFonts w:eastAsia="Times New Roman"/>
-                <w:b/>
-                <w:bCs/>
-                <w:sz w:val="24"/>
-                <w:szCs w:val="24"/>
-              </w:rPr>
-              <w:t>How the Output Was Used</w:t>
-            </w:r>
-          </w:p>
-        </w:tc>
-      </w:tr>
-      <w:tr>
-        <w:trPr>
-          <w:jc w:val="center"/>
-        </w:trPr>
-        <w:tc>
-          <w:tcPr>
-            <w:tcW w:w="1413" w:type="dxa"/>
-            <w:vAlign w:val="center"/>
-          </w:tcPr>
-          <w:p>
-            <w:proofErr w:type="spellStart"/>
-            <w:r>
-              <w:rPr>
-                <w:rFonts w:eastAsia="Times New Roman"/>
-                <w:sz w:val="24"/>
-                <w:szCs w:val="24"/>
-              </w:rPr>
-              <w:t>ChatGPT</w:t>
-            </w:r>
-            <w:proofErr w:type="spellEnd"/>
-          </w:p>
-        </w:tc>
-        <w:tc>
-          <w:tcPr>
-            <w:tcW w:w="3402" w:type="dxa"/>
-            <w:vAlign w:val="center"/>
-          </w:tcPr>
-          <w:p>
-            <w:r>
-              <w:rPr>
-                <w:rFonts w:eastAsia="Times New Roman"/>
-                <w:sz w:val="24"/>
-                <w:szCs w:val="24"/>
-              </w:rPr>
-              <w:t>Clarifying Python and data visualisation concepts</w:t>
-            </w:r>
-          </w:p>
-        </w:tc>
-        <w:tc>
-          <w:tcPr>
-            <w:tcW w:w="4201" w:type="dxa"/>
-            <w:vAlign w:val="center"/>
-          </w:tcPr>
-          <w:p>
-            <w:r>
-              <w:rPr>
-                <w:rFonts w:eastAsia="Times New Roman"/>
-                <w:sz w:val="24"/>
-                <w:szCs w:val="24"/>
-              </w:rPr>
-              <w:t>Used as a learning and troubleshooting resource.</w:t>
-            </w:r>
-          </w:p>
-        </w:tc>
-      </w:tr>
-      <w:tr>
-        <w:trPr>
-          <w:jc w:val="center"/>
-        </w:trPr>
-        <w:tc>
-          <w:tcPr>
-            <w:tcW w:w="1413" w:type="dxa"/>
-            <w:vAlign w:val="center"/>
-          </w:tcPr>
-          <w:p>
-            <w:proofErr w:type="spellStart"/>
-            <w:r>
-              <w:rPr>
-                <w:rFonts w:eastAsia="Times New Roman"/>
-                <w:sz w:val="24"/>
-                <w:szCs w:val="24"/>
-              </w:rPr>
-              <w:t>ChatGPT</w:t>
-            </w:r>
-            <w:proofErr w:type="spellEnd"/>
-          </w:p>
-        </w:tc>
-        <w:tc>
-          <w:tcPr>
-            <w:tcW w:w="3402" w:type="dxa"/>
-            <w:vAlign w:val="center"/>
-          </w:tcPr>
-          <w:p>
-            <w:r>
-              <w:rPr>
-                <w:rFonts w:eastAsia="Times New Roman"/>
-                <w:sz w:val="24"/>
-                <w:szCs w:val="24"/>
-              </w:rPr>
-              <w:t>Explaining Python errors and possible solutions</w:t>
-            </w:r>
-          </w:p>
-        </w:tc>
-        <w:tc>
-          <w:tcPr>
-            <w:tcW w:w="4201" w:type="dxa"/>
-            <w:vAlign w:val="center"/>
-          </w:tcPr>
-          <w:p>
-            <w:pPr>
-              <w:spacing w:before="100" w:beforeAutospacing="1" w:after="100" w:afterAutospacing="1" w:line="240" w:lineRule="auto"/>
-              <w:rPr>
-                <w:rFonts w:eastAsia="Times New Roman"/>
-                <w:sz w:val="24"/>
-                <w:szCs w:val="24"/>
-              </w:rPr>
-            </w:pPr>
-            <w:r>
-              <w:rPr>
-                <w:rFonts w:eastAsia="Times New Roman"/>
-                <w:sz w:val="24"/>
-                <w:szCs w:val="24"/>
-              </w:rPr>
-              <w:t>Suggestions were reviewed and tested in the notebook.</w:t>
-            </w:r>
-          </w:p>
-        </w:tc>
-      </w:tr>
-      <w:tr>
-        <w:trPr>
-          <w:jc w:val="center"/>
-        </w:trPr>
-        <w:tc>
-          <w:tcPr>
-            <w:tcW w:w="1413" w:type="dxa"/>
-            <w:vAlign w:val="center"/>
-          </w:tcPr>
-          <w:p>
-            <w:proofErr w:type="spellStart"/>
-            <w:r>
-              <w:rPr>
-                <w:rFonts w:eastAsia="Times New Roman"/>
-                <w:sz w:val="24"/>
-                <w:szCs w:val="24"/>
-              </w:rPr>
-              <w:t>ChatGPT</w:t>
-            </w:r>
-            <w:proofErr w:type="spellEnd"/>
-          </w:p>
-        </w:tc>
-        <w:tc>
-          <w:tcPr>
-            <w:tcW w:w="3402" w:type="dxa"/>
-            <w:vAlign w:val="center"/>
-          </w:tcPr>
-          <w:p>
-            <w:pPr>
-              <w:spacing w:before="100" w:beforeAutospacing="1" w:after="100" w:afterAutospacing="1" w:line="240" w:lineRule="auto"/>
-              <w:rPr>
-                <w:rFonts w:eastAsia="Times New Roman"/>
-                <w:sz w:val="24"/>
-                <w:szCs w:val="24"/>
-              </w:rPr>
-            </w:pPr>
-            <w:r>
-              <w:rPr>
-                <w:rFonts w:eastAsia="Times New Roman"/>
-                <w:sz w:val="24"/>
-                <w:szCs w:val="24"/>
-              </w:rPr>
-              <w:t>Guidance on pandas and Matplotlib</w:t>
-            </w:r>
-          </w:p>
-        </w:tc>
-        <w:tc>
-          <w:tcPr>
-            <w:tcW w:w="4201" w:type="dxa"/>
-            <w:vAlign w:val="center"/>
-          </w:tcPr>
-          <w:p>
-            <w:pPr>
-              <w:spacing w:before="100" w:beforeAutospacing="1" w:after="100" w:afterAutospacing="1" w:line="240" w:lineRule="auto"/>
-              <w:rPr>
-                <w:rFonts w:eastAsia="Times New Roman"/>
-                <w:sz w:val="24"/>
-                <w:szCs w:val="24"/>
-              </w:rPr>
-            </w:pPr>
-            <w:r>
-              <w:rPr>
-                <w:rFonts w:eastAsia="Times New Roman"/>
-                <w:sz w:val="24"/>
-                <w:szCs w:val="24"/>
-              </w:rPr>
-              <w:t>Used to understand methods and visualisation techniques.</w:t>
-            </w:r>
-          </w:p>
-        </w:tc>
-      </w:tr>
-      <w:tr>
-        <w:trPr>
-          <w:jc w:val="center"/>
-        </w:trPr>
-        <w:tc>
-          <w:tcPr>
-            <w:tcW w:w="1413" w:type="dxa"/>
-            <w:vAlign w:val="center"/>
-          </w:tcPr>
-          <w:p>
-            <w:proofErr w:type="spellStart"/>
-            <w:r>
-              <w:rPr>
-                <w:rFonts w:eastAsia="Times New Roman"/>
-                <w:sz w:val="24"/>
-                <w:szCs w:val="24"/>
-              </w:rPr>
-              <w:t>ChatGPT</w:t>
-            </w:r>
-            <w:proofErr w:type="spellEnd"/>
-          </w:p>
-        </w:tc>
-        <w:tc>
-          <w:tcPr>
-            <w:tcW w:w="3402" w:type="dxa"/>
-            <w:vAlign w:val="center"/>
-          </w:tcPr>
-          <w:p>
-            <w:pPr>
-              <w:spacing w:before="100" w:beforeAutospacing="1" w:after="100" w:afterAutospacing="1" w:line="240" w:lineRule="auto"/>
-              <w:rPr>
-                <w:rFonts w:eastAsia="Times New Roman"/>
-                <w:sz w:val="24"/>
-                <w:szCs w:val="24"/>
-              </w:rPr>
-            </w:pPr>
-            <w:r>
-              <w:rPr>
-                <w:rFonts w:eastAsia="Times New Roman"/>
-                <w:sz w:val="24"/>
-                <w:szCs w:val="24"/>
-              </w:rPr>
-              <w:t>Reviewing visualisation choices and explanations</w:t>
-            </w:r>
-          </w:p>
-        </w:tc>
-        <w:tc>
-          <w:tcPr>
-            <w:tcW w:w="4201" w:type="dxa"/>
-            <w:vAlign w:val="center"/>
-          </w:tcPr>
-          <w:p>
-            <w:pPr>
-              <w:spacing w:before="100" w:beforeAutospacing="1" w:after="100" w:afterAutospacing="1" w:line="240" w:lineRule="auto"/>
-              <w:rPr>
-                <w:rFonts w:eastAsia="Times New Roman"/>
-                <w:sz w:val="24"/>
-                <w:szCs w:val="24"/>
-              </w:rPr>
-            </w:pPr>
-            <w:r>
-              <w:rPr>
-                <w:rFonts w:eastAsia="Times New Roman"/>
-                <w:sz w:val="24"/>
-                <w:szCs w:val="24"/>
-              </w:rPr>
-              <w:t>Used as feedback while developing and reviewing the analysis.</w:t>
-            </w:r>
-          </w:p>
-        </w:tc>
-      </w:tr>
-    </w:tbl>
-    <w:p/>
-    <w:p/>
-    <w:p>
-      <w:pPr>
-        <w:pStyle w:val="Heading3"/>
-        <w:rPr>
-          <w:rFonts w:cs="Calibri"/>
-        </w:rPr>
-      </w:pPr>
-      <w:r>
-        <w:rPr>
-          <w:rFonts w:cs="Calibri"/>
-        </w:rPr>
         <w:t>Verification</w:t>
       </w:r>
     </w:p>
-    <w:p/>
     <w:p>
       <w:pPr>
         <w:rPr>
@@ -1430,28 +1442,12 @@
           <w:sz w:val="24"/>
           <w:szCs w:val="24"/>
         </w:rPr>
-        <w:t xml:space="preserve">All AI-generated information and suggestions were reviewed before being used. The code was executed and tested in the </w:t>
-      </w:r>
-      <w:proofErr w:type="spellStart"/>
-      <w:r>
-        <w:rPr>
-          <w:sz w:val="24"/>
-          <w:szCs w:val="24"/>
-        </w:rPr>
-        <w:t>Jupyter</w:t>
-      </w:r>
-      <w:proofErr w:type="spellEnd"/>
-      <w:r>
-        <w:rPr>
-          <w:sz w:val="24"/>
-          <w:szCs w:val="24"/>
-        </w:rPr>
-        <w:t xml:space="preserve"> Notebook, and the resulting visualisations and analysis were checked against the employment datasets used in the assessment.</w:t>
+        <w:t>All AI-generated information and suggestions were reviewed before being used. The code was executed and tested in the Jupyter Notebook, and the resulting visualisations and analysis were checked against the employment datasets used in the assessment.</w:t>
       </w:r>
     </w:p>
     <w:p/>
     <w:sectPr>
-      <w:footerReference w:type="default" r:id="rId14"/>
+      <w:footerReference w:type="default" r:id="rId15"/>
       <w:pgSz w:w="11906" w:h="16838"/>
       <w:pgMar w:top="1440" w:right="1440" w:bottom="1318" w:left="1440" w:header="708" w:footer="708" w:gutter="0"/>
       <w:pgNumType w:start="1"/>
@@ -1577,6 +1573,100 @@
     </w:p>
   </w:footnote>
 </w:footnotes>
+</file>
+
+<file path=word/numbering.xml><?xml version="1.0" encoding="utf-8"?>
+<w:numbering xmlns:wpc="http://schemas.microsoft.com/office/word/2010/wordprocessingCanvas" xmlns:cx="http://schemas.microsoft.com/office/drawing/2014/chartex" xmlns:cx1="http://schemas.microsoft.com/office/drawing/2015/9/8/chartex" xmlns:cx2="http://schemas.microsoft.com/office/drawing/2015/10/21/chartex" xmlns:cx3="http://schemas.microsoft.com/office/drawing/2016/5/9/chartex" xmlns:cx4="http://schemas.microsoft.com/office/drawing/2016/5/10/chartex" xmlns:cx5="http://schemas.microsoft.com/office/drawing/2016/5/11/chartex" xmlns:cx6="http://schemas.microsoft.com/office/drawing/2016/5/12/chartex" xmlns:cx7="http://schemas.microsoft.com/office/drawing/2016/5/13/chartex" xmlns:cx8="http://schemas.microsoft.com/office/drawing/2016/5/14/chartex" xmlns:mc="http://schemas.openxmlformats.org/markup-compatibility/2006" xmlns:aink="http://schemas.microsoft.com/office/drawing/2016/ink" xmlns:am3d="http://schemas.microsoft.com/office/drawing/2017/model3d" xmlns:o="urn:schemas-microsoft-com:office:office" xmlns:r="http://schemas.openxmlformats.org/officeDocument/2006/relationships" xmlns:m="http://schemas.openxmlformats.org/officeDocument/2006/math" xmlns:v="urn:schemas-microsoft-com:vml" xmlns:wp14="http://schemas.microsoft.com/office/word/2010/wordprocessingDrawing" xmlns:wp="http://schemas.openxmlformats.org/drawingml/2006/wordprocessingDrawing" xmlns:w10="urn:schemas-microsoft-com:office:word" xmlns:w="http://schemas.openxmlformats.org/wordprocessingml/2006/main" xmlns:w14="http://schemas.microsoft.com/office/word/2010/wordml" xmlns:w15="http://schemas.microsoft.com/office/word/2012/wordml" xmlns:w16cex="http://schemas.microsoft.com/office/word/2018/wordml/cex" xmlns:w16cid="http://schemas.microsoft.com/office/word/2016/wordml/cid" xmlns:w16="http://schemas.microsoft.com/office/word/2018/wordml" xmlns:w16sdtdh="http://schemas.microsoft.com/office/word/2020/wordml/sdtdatahash" xmlns:w16se="http://schemas.microsoft.com/office/word/2015/wordml/symex" xmlns:wpg="http://schemas.microsoft.com/office/word/2010/wordprocessingGroup" xmlns:wpi="http://schemas.microsoft.com/office/word/2010/wordprocessingInk" xmlns:wne="http://schemas.microsoft.com/office/word/2006/wordml" xmlns:wps="http://schemas.microsoft.com/office/word/2010/wordprocessingShape" mc:Ignorable="w14 w15 w16se w16cid w16 w16cex w16sdtdh wp14">
+  <w:abstractNum w:abstractNumId="0" w15:restartNumberingAfterBreak="0">
+    <w:nsid w:val="1D7A06A2"/>
+    <w:multiLevelType w:val="hybridMultilevel"/>
+    <w:tmpl w:val="F858F2DE"/>
+    <w:lvl w:ilvl="0" w:tplc="1809000F">
+      <w:start w:val="1"/>
+      <w:numFmt w:val="decimal"/>
+      <w:lvlText w:val="%1."/>
+      <w:lvlJc w:val="left"/>
+      <w:pPr>
+        <w:ind w:left="720" w:hanging="360"/>
+      </w:pPr>
+    </w:lvl>
+    <w:lvl w:ilvl="1" w:tplc="18090019" w:tentative="1">
+      <w:start w:val="1"/>
+      <w:numFmt w:val="lowerLetter"/>
+      <w:lvlText w:val="%2."/>
+      <w:lvlJc w:val="left"/>
+      <w:pPr>
+        <w:ind w:left="1440" w:hanging="360"/>
+      </w:pPr>
+    </w:lvl>
+    <w:lvl w:ilvl="2" w:tplc="1809001B" w:tentative="1">
+      <w:start w:val="1"/>
+      <w:numFmt w:val="lowerRoman"/>
+      <w:lvlText w:val="%3."/>
+      <w:lvlJc w:val="right"/>
+      <w:pPr>
+        <w:ind w:left="2160" w:hanging="180"/>
+      </w:pPr>
+    </w:lvl>
+    <w:lvl w:ilvl="3" w:tplc="1809000F" w:tentative="1">
+      <w:start w:val="1"/>
+      <w:numFmt w:val="decimal"/>
+      <w:lvlText w:val="%4."/>
+      <w:lvlJc w:val="left"/>
+      <w:pPr>
+        <w:ind w:left="2880" w:hanging="360"/>
+      </w:pPr>
+    </w:lvl>
+    <w:lvl w:ilvl="4" w:tplc="18090019" w:tentative="1">
+      <w:start w:val="1"/>
+      <w:numFmt w:val="lowerLetter"/>
+      <w:lvlText w:val="%5."/>
+      <w:lvlJc w:val="left"/>
+      <w:pPr>
+        <w:ind w:left="3600" w:hanging="360"/>
+      </w:pPr>
+    </w:lvl>
+    <w:lvl w:ilvl="5" w:tplc="1809001B" w:tentative="1">
+      <w:start w:val="1"/>
+      <w:numFmt w:val="lowerRoman"/>
+      <w:lvlText w:val="%6."/>
+      <w:lvlJc w:val="right"/>
+      <w:pPr>
+        <w:ind w:left="4320" w:hanging="180"/>
+      </w:pPr>
+    </w:lvl>
+    <w:lvl w:ilvl="6" w:tplc="1809000F" w:tentative="1">
+      <w:start w:val="1"/>
+      <w:numFmt w:val="decimal"/>
+      <w:lvlText w:val="%7."/>
+      <w:lvlJc w:val="left"/>
+      <w:pPr>
+        <w:ind w:left="5040" w:hanging="360"/>
+      </w:pPr>
+    </w:lvl>
+    <w:lvl w:ilvl="7" w:tplc="18090019" w:tentative="1">
+      <w:start w:val="1"/>
+      <w:numFmt w:val="lowerLetter"/>
+      <w:lvlText w:val="%8."/>
+      <w:lvlJc w:val="left"/>
+      <w:pPr>
+        <w:ind w:left="5760" w:hanging="360"/>
+      </w:pPr>
+    </w:lvl>
+    <w:lvl w:ilvl="8" w:tplc="1809001B" w:tentative="1">
+      <w:start w:val="1"/>
+      <w:numFmt w:val="lowerRoman"/>
+      <w:lvlText w:val="%9."/>
+      <w:lvlJc w:val="right"/>
+      <w:pPr>
+        <w:ind w:left="6480" w:hanging="180"/>
+      </w:pPr>
+    </w:lvl>
+  </w:abstractNum>
+  <w:num w:numId="1">
+    <w:abstractNumId w:val="0"/>
+  </w:num>
+</w:numbering>
 </file>
 
 <file path=word/styles.xml><?xml version="1.0" encoding="utf-8"?>
@@ -2967,17 +3057,18 @@
 </file>
 
 <file path=customXml/item1.xml><?xml version="1.0" encoding="utf-8"?>
-<go:gDocsCustomXmlDataStorage xmlns:go="http://customooxmlschemas.google.com/" xmlns:r="http://schemas.openxmlformats.org/officeDocument/2006/relationships" uri="GoogleDocsCustomDataVersion2">
-  <go:docsCustomData xmlns:go="http://customooxmlschemas.google.com/" roundtripDataSignature="AMtx7miehlgh2pzFvkmpnhkVaeODs3Wnuw==">CgMxLjAyCGguZ2pkZ3hzMgloLjMwajB6bGwyCWguMWZvYjl0ZTIJaC4zem55c2g3MgloLjJldDkycDAyDmgua2ZranMzcndsMmMxOAByITF6bEVRVXYyWkdtTjZWemdfYk5uaGpmb0x1c2hhYUo3dw==</go:docsCustomData>
-</go:gDocsCustomXmlDataStorage>
+<b:Sources xmlns:b="http://schemas.openxmlformats.org/officeDocument/2006/bibliography" xmlns="http://schemas.openxmlformats.org/officeDocument/2006/bibliography" SelectedStyle="\APASixthEditionOfficeOnline.xsl" StyleName="APA" Version="6"/>
 </file>
 
 <file path=customXml/item2.xml><?xml version="1.0" encoding="utf-8"?>
-<p:properties xmlns:p="http://schemas.microsoft.com/office/2006/metadata/properties" xmlns:xsi="http://www.w3.org/2001/XMLSchema-instance" xmlns:pc="http://schemas.microsoft.com/office/infopath/2007/PartnerControls">
-  <documentManagement>
-    <_activity xmlns="b16a9495-4dfd-42d3-807b-98cb11f03b43" xsi:nil="true"/>
-  </documentManagement>
-</p:properties>
+<s:customData xmlns="http://www.wps.cn/officeDocument/2013/wpsCustomData" xmlns:s="http://www.wps.cn/officeDocument/2013/wpsCustomData">
+  <customSectProps>
+    <customSectPr/>
+  </customSectProps>
+  <customShpExts>
+    <customShpInfo spid="_x0000_s1026" textRotate="1"/>
+  </customShpExts>
+</s:customData>
 </file>
 
 <file path=customXml/item3.xml><?xml version="1.0" encoding="utf-8"?>
@@ -2990,18 +3081,17 @@
 </file>
 
 <file path=customXml/item4.xml><?xml version="1.0" encoding="utf-8"?>
-<s:customData xmlns="http://www.wps.cn/officeDocument/2013/wpsCustomData" xmlns:s="http://www.wps.cn/officeDocument/2013/wpsCustomData">
-  <customSectProps>
-    <customSectPr/>
-  </customSectProps>
-  <customShpExts>
-    <customShpInfo spid="_x0000_s1026" textRotate="1"/>
-  </customShpExts>
-</s:customData>
+<p:properties xmlns:p="http://schemas.microsoft.com/office/2006/metadata/properties" xmlns:xsi="http://www.w3.org/2001/XMLSchema-instance" xmlns:pc="http://schemas.microsoft.com/office/infopath/2007/PartnerControls">
+  <documentManagement>
+    <_activity xmlns="b16a9495-4dfd-42d3-807b-98cb11f03b43" xsi:nil="true"/>
+  </documentManagement>
+</p:properties>
 </file>
 
 <file path=customXml/item5.xml><?xml version="1.0" encoding="utf-8"?>
-<b:Sources xmlns:b="http://schemas.openxmlformats.org/officeDocument/2006/bibliography" xmlns="http://schemas.openxmlformats.org/officeDocument/2006/bibliography" SelectedStyle="\APASixthEditionOfficeOnline.xsl" StyleName="APA" Version="6"/>
+<go:gDocsCustomXmlDataStorage xmlns:go="http://customooxmlschemas.google.com/" xmlns:r="http://schemas.openxmlformats.org/officeDocument/2006/relationships" uri="GoogleDocsCustomDataVersion2">
+  <go:docsCustomData xmlns:go="http://customooxmlschemas.google.com/" roundtripDataSignature="AMtx7miehlgh2pzFvkmpnhkVaeODs3Wnuw==">CgMxLjAyCGguZ2pkZ3hzMgloLjMwajB6bGwyCWguMWZvYjl0ZTIJaC4zem55c2g3MgloLjJldDkycDAyDmgua2ZranMzcndsMmMxOAByITF6bEVRVXYyWkdtTjZWemdfYk5uaGpmb0x1c2hhYUo3dw==</go:docsCustomData>
+</go:gDocsCustomXmlDataStorage>
 </file>
 
 <file path=customXml/item6.xml><?xml version="1.0" encoding="utf-8"?>
@@ -3155,20 +3245,17 @@
 </file>
 
 <file path=customXml/itemProps1.xml><?xml version="1.0" encoding="utf-8"?>
-<ds:datastoreItem xmlns:ds="http://schemas.openxmlformats.org/officeDocument/2006/customXml" ds:itemID="{11111111-1234-1234-1234-123412341234}">
+<ds:datastoreItem xmlns:ds="http://schemas.openxmlformats.org/officeDocument/2006/customXml" ds:itemID="{A5C61161-19E4-4D42-A5DA-EC591AFE0A7D}">
   <ds:schemaRefs>
-    <ds:schemaRef ds:uri="http://customooxmlschemas.google.com/"/>
-    <ds:schemaRef ds:uri="http://schemas.openxmlformats.org/officeDocument/2006/relationships"/>
+    <ds:schemaRef ds:uri="http://schemas.openxmlformats.org/officeDocument/2006/bibliography"/>
   </ds:schemaRefs>
 </ds:datastoreItem>
 </file>
 
 <file path=customXml/itemProps2.xml><?xml version="1.0" encoding="utf-8"?>
-<ds:datastoreItem xmlns:ds="http://schemas.openxmlformats.org/officeDocument/2006/customXml" ds:itemID="{D51EB97A-8C7A-4EE1-A3AD-E57FDBFA6BEE}">
+<ds:datastoreItem xmlns:ds="http://schemas.openxmlformats.org/officeDocument/2006/customXml" ds:itemID="{B1977F7D-205B-4081-913C-38D41E755F92}">
   <ds:schemaRefs>
-    <ds:schemaRef ds:uri="http://schemas.microsoft.com/office/2006/metadata/properties"/>
-    <ds:schemaRef ds:uri="http://schemas.microsoft.com/office/infopath/2007/PartnerControls"/>
-    <ds:schemaRef ds:uri="b16a9495-4dfd-42d3-807b-98cb11f03b43"/>
+    <ds:schemaRef ds:uri="http://www.wps.cn/officeDocument/2013/wpsCustomData"/>
   </ds:schemaRefs>
 </ds:datastoreItem>
 </file>
@@ -3182,17 +3269,20 @@
 </file>
 
 <file path=customXml/itemProps4.xml><?xml version="1.0" encoding="utf-8"?>
-<ds:datastoreItem xmlns:ds="http://schemas.openxmlformats.org/officeDocument/2006/customXml" ds:itemID="{B1977F7D-205B-4081-913C-38D41E755F92}">
+<ds:datastoreItem xmlns:ds="http://schemas.openxmlformats.org/officeDocument/2006/customXml" ds:itemID="{D51EB97A-8C7A-4EE1-A3AD-E57FDBFA6BEE}">
   <ds:schemaRefs>
-    <ds:schemaRef ds:uri="http://www.wps.cn/officeDocument/2013/wpsCustomData"/>
+    <ds:schemaRef ds:uri="http://schemas.microsoft.com/office/2006/metadata/properties"/>
+    <ds:schemaRef ds:uri="http://schemas.microsoft.com/office/infopath/2007/PartnerControls"/>
+    <ds:schemaRef ds:uri="b16a9495-4dfd-42d3-807b-98cb11f03b43"/>
   </ds:schemaRefs>
 </ds:datastoreItem>
 </file>
 
 <file path=customXml/itemProps5.xml><?xml version="1.0" encoding="utf-8"?>
-<ds:datastoreItem xmlns:ds="http://schemas.openxmlformats.org/officeDocument/2006/customXml" ds:itemID="{A5C61161-19E4-4D42-A5DA-EC591AFE0A7D}">
+<ds:datastoreItem xmlns:ds="http://schemas.openxmlformats.org/officeDocument/2006/customXml" ds:itemID="{11111111-1234-1234-1234-123412341234}">
   <ds:schemaRefs>
-    <ds:schemaRef ds:uri="http://schemas.openxmlformats.org/officeDocument/2006/bibliography"/>
+    <ds:schemaRef ds:uri="http://customooxmlschemas.google.com/"/>
+    <ds:schemaRef ds:uri="http://schemas.openxmlformats.org/officeDocument/2006/relationships"/>
   </ds:schemaRefs>
 </ds:datastoreItem>
 </file>

</xml_diff>

<commit_message>
docs: refine AI fluency reflection
</commit_message>
<xml_diff>
--- a/CA1 - Caio Jacob (2023168) - Data Visualisation (AI use).docx
+++ b/CA1 - Caio Jacob (2023168) - Data Visualisation (AI use).docx
@@ -572,13 +572,23 @@
                 <w:szCs w:val="32"/>
               </w:rPr>
             </w:pPr>
+            <w:proofErr w:type="spellStart"/>
             <w:r>
               <w:rPr>
                 <w:color w:val="000000"/>
                 <w:sz w:val="32"/>
                 <w:szCs w:val="32"/>
               </w:rPr>
-              <w:t>Taufique Ahmed</w:t>
+              <w:t>Taufique</w:t>
+            </w:r>
+            <w:proofErr w:type="spellEnd"/>
+            <w:r>
+              <w:rPr>
+                <w:color w:val="000000"/>
+                <w:sz w:val="32"/>
+                <w:szCs w:val="32"/>
+              </w:rPr>
+              <w:t xml:space="preserve"> Ahmed</w:t>
             </w:r>
           </w:p>
         </w:tc>
@@ -965,7 +975,21 @@
           <w:rFonts w:cs="Calibri"/>
           <w:lang w:val="en-GB"/>
         </w:rPr>
-        <w:t xml:space="preserve"> – Use of Artificial Intelligence (AI)</w:t>
+        <w:t xml:space="preserve"> </w:t>
+      </w:r>
+      <w:r>
+        <w:rPr>
+          <w:rFonts w:cs="Calibri"/>
+          <w:lang w:val="en-GB"/>
+        </w:rPr>
+        <w:t>-</w:t>
+      </w:r>
+      <w:r>
+        <w:rPr>
+          <w:rFonts w:cs="Calibri"/>
+          <w:lang w:val="en-GB"/>
+        </w:rPr>
+        <w:t xml:space="preserve"> Use of Artificial Intelligence (AI)</w:t>
       </w:r>
       <w:bookmarkEnd w:id="3"/>
     </w:p>
@@ -1007,15 +1031,10 @@
       </w:r>
     </w:p>
     <w:p>
-      <w:r>
-        <w:rPr>
-          <w:rFonts w:eastAsiaTheme="majorEastAsia"/>
-          <w:color w:val="3A3A3A" w:themeColor="background2" w:themeShade="40"/>
-          <w:spacing w:val="-10"/>
-          <w:kern w:val="28"/>
-          <w:sz w:val="28"/>
-          <w:szCs w:val="28"/>
-        </w:rPr>
+      <w:pPr>
+        <w:pStyle w:val="Heading3"/>
+      </w:pPr>
+      <w:r>
         <w:t>AI Prompts and Relevant Outputs – Selected Examples</w:t>
       </w:r>
     </w:p>
@@ -1415,7 +1434,6 @@
         <w:t>The values were checked against the employment dataset and the scatter plot was generated in the notebook.</w:t>
       </w:r>
     </w:p>
-    <w:p/>
     <w:p>
       <w:pPr>
         <w:pStyle w:val="Heading3"/>
@@ -1442,10 +1460,117 @@
           <w:sz w:val="24"/>
           <w:szCs w:val="24"/>
         </w:rPr>
-        <w:t>All AI-generated information and suggestions were reviewed before being used. The code was executed and tested in the Jupyter Notebook, and the resulting visualisations and analysis were checked against the employment datasets used in the assessment.</w:t>
+        <w:t xml:space="preserve">All AI-generated information and suggestions were reviewed before being used. The code was executed and tested in the </w:t>
+      </w:r>
+      <w:proofErr w:type="spellStart"/>
+      <w:r>
+        <w:rPr>
+          <w:sz w:val="24"/>
+          <w:szCs w:val="24"/>
+        </w:rPr>
+        <w:t>Jupyter</w:t>
+      </w:r>
+      <w:proofErr w:type="spellEnd"/>
+      <w:r>
+        <w:rPr>
+          <w:sz w:val="24"/>
+          <w:szCs w:val="24"/>
+        </w:rPr>
+        <w:t xml:space="preserve"> Notebook, and the resulting visualisations and analysis were checked against the employment datasets used in the assessment.</w:t>
+      </w:r>
+    </w:p>
+    <w:p>
+      <w:pPr>
+        <w:spacing w:after="0" w:line="240" w:lineRule="auto"/>
+      </w:pPr>
+      <w:r>
+        <w:br w:type="page"/>
+      </w:r>
+    </w:p>
+    <w:p>
+      <w:pPr>
+        <w:pStyle w:val="Heading1"/>
+      </w:pPr>
+      <w:r>
+        <w:lastRenderedPageBreak/>
+        <w:t>AI Fluency Framework Reflection</w:t>
       </w:r>
     </w:p>
     <w:p/>
+    <w:p>
+      <w:pPr>
+        <w:pStyle w:val="Heading3"/>
+      </w:pPr>
+      <w:r>
+        <w:t>1. Delegation</w:t>
+      </w:r>
+    </w:p>
+    <w:p>
+      <w:r>
+        <w:t xml:space="preserve">I used </w:t>
+      </w:r>
+      <w:proofErr w:type="spellStart"/>
+      <w:r>
+        <w:t>ChatGPT</w:t>
+      </w:r>
+      <w:proofErr w:type="spellEnd"/>
+      <w:r>
+        <w:t xml:space="preserve"> when I needed clarification on Python errors and visualisation choices. I found it most useful for understanding problems and evaluating alternatives, while the implementation and final decisions remained my responsibility.</w:t>
+      </w:r>
+    </w:p>
+    <w:p>
+      <w:pPr>
+        <w:pStyle w:val="Heading3"/>
+      </w:pPr>
+      <w:r>
+        <w:t>2. Description</w:t>
+      </w:r>
+    </w:p>
+    <w:p>
+      <w:r>
+        <w:t xml:space="preserve">The quality of the responses depended on how </w:t>
+      </w:r>
+      <w:r>
+        <w:t>clearly,</w:t>
+      </w:r>
+      <w:r>
+        <w:t xml:space="preserve"> I described the problem. When an error occurred, sharing the relevant code, error message and available variable names helped me obtain more relevant guidance. I also refined my questions when an initial suggestion did not fit the notebook.</w:t>
+      </w:r>
+    </w:p>
+    <w:p>
+      <w:pPr>
+        <w:pStyle w:val="Heading3"/>
+      </w:pPr>
+      <w:r>
+        <w:t>3. Discernment</w:t>
+      </w:r>
+    </w:p>
+    <w:p>
+      <w:r>
+        <w:t xml:space="preserve">I learned that AI suggestions need to be evaluated rather than accepted automatically. For example, the advice about the undefined `df_2023` variable had to be adapted to the actual </w:t>
+      </w:r>
+      <w:proofErr w:type="spellStart"/>
+      <w:r>
+        <w:t>DataFrame</w:t>
+      </w:r>
+      <w:proofErr w:type="spellEnd"/>
+      <w:r>
+        <w:t xml:space="preserve"> name in my notebook. I also assessed whether the visualisations communicated the data clearly and whether the conclusions were supported by the results.</w:t>
+      </w:r>
+    </w:p>
+    <w:p>
+      <w:pPr>
+        <w:pStyle w:val="Heading3"/>
+      </w:pPr>
+      <w:r>
+        <w:t>4. Diligence</w:t>
+      </w:r>
+    </w:p>
+    <w:p>
+      <w:r>
+        <w:t>I am responsible for the accuracy and integrity of the submitted work. This includes checking the analysis against the BLS datasets, ensuring that the notebook runs correctly, acknowledging AI assistance and making sure that the final submission reflects my own understanding.</w:t>
+      </w:r>
+    </w:p>
     <w:sectPr>
       <w:footerReference w:type="default" r:id="rId15"/>
       <w:pgSz w:w="11906" w:h="16838"/>
@@ -3057,44 +3182,6 @@
 </file>
 
 <file path=customXml/item1.xml><?xml version="1.0" encoding="utf-8"?>
-<b:Sources xmlns:b="http://schemas.openxmlformats.org/officeDocument/2006/bibliography" xmlns="http://schemas.openxmlformats.org/officeDocument/2006/bibliography" SelectedStyle="\APASixthEditionOfficeOnline.xsl" StyleName="APA" Version="6"/>
-</file>
-
-<file path=customXml/item2.xml><?xml version="1.0" encoding="utf-8"?>
-<s:customData xmlns="http://www.wps.cn/officeDocument/2013/wpsCustomData" xmlns:s="http://www.wps.cn/officeDocument/2013/wpsCustomData">
-  <customSectProps>
-    <customSectPr/>
-  </customSectProps>
-  <customShpExts>
-    <customShpInfo spid="_x0000_s1026" textRotate="1"/>
-  </customShpExts>
-</s:customData>
-</file>
-
-<file path=customXml/item3.xml><?xml version="1.0" encoding="utf-8"?>
-<?mso-contentType ?>
-<FormTemplates xmlns="http://schemas.microsoft.com/sharepoint/v3/contenttype/forms">
-  <Display>DocumentLibraryForm</Display>
-  <Edit>DocumentLibraryForm</Edit>
-  <New>DocumentLibraryForm</New>
-</FormTemplates>
-</file>
-
-<file path=customXml/item4.xml><?xml version="1.0" encoding="utf-8"?>
-<p:properties xmlns:p="http://schemas.microsoft.com/office/2006/metadata/properties" xmlns:xsi="http://www.w3.org/2001/XMLSchema-instance" xmlns:pc="http://schemas.microsoft.com/office/infopath/2007/PartnerControls">
-  <documentManagement>
-    <_activity xmlns="b16a9495-4dfd-42d3-807b-98cb11f03b43" xsi:nil="true"/>
-  </documentManagement>
-</p:properties>
-</file>
-
-<file path=customXml/item5.xml><?xml version="1.0" encoding="utf-8"?>
-<go:gDocsCustomXmlDataStorage xmlns:go="http://customooxmlschemas.google.com/" xmlns:r="http://schemas.openxmlformats.org/officeDocument/2006/relationships" uri="GoogleDocsCustomDataVersion2">
-  <go:docsCustomData xmlns:go="http://customooxmlschemas.google.com/" roundtripDataSignature="AMtx7miehlgh2pzFvkmpnhkVaeODs3Wnuw==">CgMxLjAyCGguZ2pkZ3hzMgloLjMwajB6bGwyCWguMWZvYjl0ZTIJaC4zem55c2g3MgloLjJldDkycDAyDmgua2ZranMzcndsMmMxOAByITF6bEVRVXYyWkdtTjZWemdfYk5uaGpmb0x1c2hhYUo3dw==</go:docsCustomData>
-</go:gDocsCustomXmlDataStorage>
-</file>
-
-<file path=customXml/item6.xml><?xml version="1.0" encoding="utf-8"?>
 <ct:contentTypeSchema xmlns:ct="http://schemas.microsoft.com/office/2006/metadata/contentType" xmlns:ma="http://schemas.microsoft.com/office/2006/metadata/properties/metaAttributes" ct:_="" ma:_="" ma:contentTypeName="Document" ma:contentTypeID="0x01010091CA7052A48FB44E8BAE44044031FC77" ma:contentTypeVersion="5" ma:contentTypeDescription="Create a new document." ma:contentTypeScope="" ma:versionID="72110da391d7bf7bbbd9879cda66318c">
   <xsd:schema xmlns:xsd="http://www.w3.org/2001/XMLSchema" xmlns:xs="http://www.w3.org/2001/XMLSchema" xmlns:p="http://schemas.microsoft.com/office/2006/metadata/properties" xmlns:ns3="b16a9495-4dfd-42d3-807b-98cb11f03b43" targetNamespace="http://schemas.microsoft.com/office/2006/metadata/properties" ma:root="true" ma:fieldsID="65d4c4ab10123b5e2192ffab3149626d" ns3:_="">
     <xsd:import namespace="b16a9495-4dfd-42d3-807b-98cb11f03b43"/>
@@ -3244,50 +3331,45 @@
 </ct:contentTypeSchema>
 </file>
 
-<file path=customXml/itemProps1.xml><?xml version="1.0" encoding="utf-8"?>
-<ds:datastoreItem xmlns:ds="http://schemas.openxmlformats.org/officeDocument/2006/customXml" ds:itemID="{A5C61161-19E4-4D42-A5DA-EC591AFE0A7D}">
-  <ds:schemaRefs>
-    <ds:schemaRef ds:uri="http://schemas.openxmlformats.org/officeDocument/2006/bibliography"/>
-  </ds:schemaRefs>
-</ds:datastoreItem>
+<file path=customXml/item2.xml><?xml version="1.0" encoding="utf-8"?>
+<go:gDocsCustomXmlDataStorage xmlns:go="http://customooxmlschemas.google.com/" xmlns:r="http://schemas.openxmlformats.org/officeDocument/2006/relationships" uri="GoogleDocsCustomDataVersion2">
+  <go:docsCustomData xmlns:go="http://customooxmlschemas.google.com/" roundtripDataSignature="AMtx7miehlgh2pzFvkmpnhkVaeODs3Wnuw==">CgMxLjAyCGguZ2pkZ3hzMgloLjMwajB6bGwyCWguMWZvYjl0ZTIJaC4zem55c2g3MgloLjJldDkycDAyDmgua2ZranMzcndsMmMxOAByITF6bEVRVXYyWkdtTjZWemdfYk5uaGpmb0x1c2hhYUo3dw==</go:docsCustomData>
+</go:gDocsCustomXmlDataStorage>
 </file>
 
-<file path=customXml/itemProps2.xml><?xml version="1.0" encoding="utf-8"?>
-<ds:datastoreItem xmlns:ds="http://schemas.openxmlformats.org/officeDocument/2006/customXml" ds:itemID="{B1977F7D-205B-4081-913C-38D41E755F92}">
-  <ds:schemaRefs>
-    <ds:schemaRef ds:uri="http://www.wps.cn/officeDocument/2013/wpsCustomData"/>
-  </ds:schemaRefs>
-</ds:datastoreItem>
+<file path=customXml/item3.xml><?xml version="1.0" encoding="utf-8"?>
+<p:properties xmlns:p="http://schemas.microsoft.com/office/2006/metadata/properties" xmlns:xsi="http://www.w3.org/2001/XMLSchema-instance" xmlns:pc="http://schemas.microsoft.com/office/infopath/2007/PartnerControls">
+  <documentManagement>
+    <_activity xmlns="b16a9495-4dfd-42d3-807b-98cb11f03b43" xsi:nil="true"/>
+  </documentManagement>
+</p:properties>
 </file>
 
-<file path=customXml/itemProps3.xml><?xml version="1.0" encoding="utf-8"?>
-<ds:datastoreItem xmlns:ds="http://schemas.openxmlformats.org/officeDocument/2006/customXml" ds:itemID="{AD64260C-1345-4C21-A804-B9FBE7B91489}">
-  <ds:schemaRefs>
-    <ds:schemaRef ds:uri="http://schemas.microsoft.com/sharepoint/v3/contenttype/forms"/>
-  </ds:schemaRefs>
-</ds:datastoreItem>
+<file path=customXml/item4.xml><?xml version="1.0" encoding="utf-8"?>
+<?mso-contentType ?>
+<FormTemplates xmlns="http://schemas.microsoft.com/sharepoint/v3/contenttype/forms">
+  <Display>DocumentLibraryForm</Display>
+  <Edit>DocumentLibraryForm</Edit>
+  <New>DocumentLibraryForm</New>
+</FormTemplates>
 </file>
 
-<file path=customXml/itemProps4.xml><?xml version="1.0" encoding="utf-8"?>
-<ds:datastoreItem xmlns:ds="http://schemas.openxmlformats.org/officeDocument/2006/customXml" ds:itemID="{D51EB97A-8C7A-4EE1-A3AD-E57FDBFA6BEE}">
-  <ds:schemaRefs>
-    <ds:schemaRef ds:uri="http://schemas.microsoft.com/office/2006/metadata/properties"/>
-    <ds:schemaRef ds:uri="http://schemas.microsoft.com/office/infopath/2007/PartnerControls"/>
-    <ds:schemaRef ds:uri="b16a9495-4dfd-42d3-807b-98cb11f03b43"/>
-  </ds:schemaRefs>
-</ds:datastoreItem>
+<file path=customXml/item5.xml><?xml version="1.0" encoding="utf-8"?>
+<s:customData xmlns="http://www.wps.cn/officeDocument/2013/wpsCustomData" xmlns:s="http://www.wps.cn/officeDocument/2013/wpsCustomData">
+  <customSectProps>
+    <customSectPr/>
+  </customSectProps>
+  <customShpExts>
+    <customShpInfo spid="_x0000_s1026" textRotate="1"/>
+  </customShpExts>
+</s:customData>
 </file>
 
-<file path=customXml/itemProps5.xml><?xml version="1.0" encoding="utf-8"?>
-<ds:datastoreItem xmlns:ds="http://schemas.openxmlformats.org/officeDocument/2006/customXml" ds:itemID="{11111111-1234-1234-1234-123412341234}">
-  <ds:schemaRefs>
-    <ds:schemaRef ds:uri="http://customooxmlschemas.google.com/"/>
-    <ds:schemaRef ds:uri="http://schemas.openxmlformats.org/officeDocument/2006/relationships"/>
-  </ds:schemaRefs>
-</ds:datastoreItem>
+<file path=customXml/item6.xml><?xml version="1.0" encoding="utf-8"?>
+<b:Sources xmlns:b="http://schemas.openxmlformats.org/officeDocument/2006/bibliography" xmlns="http://schemas.openxmlformats.org/officeDocument/2006/bibliography" SelectedStyle="\APASixthEditionOfficeOnline.xsl" StyleName="APA" Version="6"/>
 </file>
 
-<file path=customXml/itemProps6.xml><?xml version="1.0" encoding="utf-8"?>
+<file path=customXml/itemProps1.xml><?xml version="1.0" encoding="utf-8"?>
 <ds:datastoreItem xmlns:ds="http://schemas.openxmlformats.org/officeDocument/2006/customXml" ds:itemID="{1CD39011-2B34-4226-8638-59B13D86301D}">
   <ds:schemaRefs>
     <ds:schemaRef ds:uri="http://schemas.microsoft.com/office/2006/metadata/contentType"/>
@@ -3303,4 +3385,47 @@
     <ds:schemaRef ds:uri="http://schemas.microsoft.com/internal/obd"/>
   </ds:schemaRefs>
 </ds:datastoreItem>
+</file>
+
+<file path=customXml/itemProps2.xml><?xml version="1.0" encoding="utf-8"?>
+<ds:datastoreItem xmlns:ds="http://schemas.openxmlformats.org/officeDocument/2006/customXml" ds:itemID="{11111111-1234-1234-1234-123412341234}">
+  <ds:schemaRefs>
+    <ds:schemaRef ds:uri="http://customooxmlschemas.google.com/"/>
+    <ds:schemaRef ds:uri="http://schemas.openxmlformats.org/officeDocument/2006/relationships"/>
+  </ds:schemaRefs>
+</ds:datastoreItem>
+</file>
+
+<file path=customXml/itemProps3.xml><?xml version="1.0" encoding="utf-8"?>
+<ds:datastoreItem xmlns:ds="http://schemas.openxmlformats.org/officeDocument/2006/customXml" ds:itemID="{D51EB97A-8C7A-4EE1-A3AD-E57FDBFA6BEE}">
+  <ds:schemaRefs>
+    <ds:schemaRef ds:uri="http://schemas.microsoft.com/office/2006/metadata/properties"/>
+    <ds:schemaRef ds:uri="http://schemas.microsoft.com/office/infopath/2007/PartnerControls"/>
+    <ds:schemaRef ds:uri="b16a9495-4dfd-42d3-807b-98cb11f03b43"/>
+  </ds:schemaRefs>
+</ds:datastoreItem>
+</file>
+
+<file path=customXml/itemProps4.xml><?xml version="1.0" encoding="utf-8"?>
+<ds:datastoreItem xmlns:ds="http://schemas.openxmlformats.org/officeDocument/2006/customXml" ds:itemID="{AD64260C-1345-4C21-A804-B9FBE7B91489}">
+  <ds:schemaRefs>
+    <ds:schemaRef ds:uri="http://schemas.microsoft.com/sharepoint/v3/contenttype/forms"/>
+  </ds:schemaRefs>
+</ds:datastoreItem>
+</file>
+
+<file path=customXml/itemProps5.xml><?xml version="1.0" encoding="utf-8"?>
+<ds:datastoreItem xmlns:ds="http://schemas.openxmlformats.org/officeDocument/2006/customXml" ds:itemID="{B1977F7D-205B-4081-913C-38D41E755F92}">
+  <ds:schemaRefs>
+    <ds:schemaRef ds:uri="http://www.wps.cn/officeDocument/2013/wpsCustomData"/>
+  </ds:schemaRefs>
+</ds:datastoreItem>
+</file>
+
+<file path=customXml/itemProps6.xml><?xml version="1.0" encoding="utf-8"?>
+<ds:datastoreItem xmlns:ds="http://schemas.openxmlformats.org/officeDocument/2006/customXml" ds:itemID="{A5C61161-19E4-4D42-A5DA-EC591AFE0A7D}">
+  <ds:schemaRefs>
+    <ds:schemaRef ds:uri="http://schemas.openxmlformats.org/officeDocument/2006/bibliography"/>
+  </ds:schemaRefs>
+</ds:datastoreItem>
 </file>
</xml_diff>